<commit_message>
docs: add agent guide and update thesis document
</commit_message>
<xml_diff>
--- a/papers/ИС61_fpm_КозинАА_2026.docx
+++ b/papers/ИС61_fpm_КозинАА_2026.docx
@@ -3491,6 +3491,12 @@
           <w:szCs w:val="28"/>
         </w:rPr>
         <w:t xml:space="preserve">Спекулятивное декодирование (speculative decoding, SD), предложенное Leviathan и соавторами [10] и независимо Chen и соавторами [4], стало промышленным стандартом ускорения инференса без потери качества и реализовано в системах vLLM, TensorRT-LLM и SGLang. Дешёвая черновая модель за один проход предлагает блок из нескольких токенов, а дорогая целевая модель проверяет их одним параллельным проходом; правило </w:t>
+      </w:r>
+      <w:r>
+        <w:rPr>
+          <w:sz w:val="28"/>
+          <w:szCs w:val="28"/>
+        </w:rPr>
         <w:lastRenderedPageBreak/>
         <w:t>modified rejection sampling гарантирует, что итоговое распределение принятых токенов совпадает с распределением целевой модели. Выигрыш достигается тогда, когда черновая модель угадывает достаточную долю токенов и за один дорогой проход подтверждается сразу несколько. Однако исходная формулировка использует фиксированную длину черновика и строгое правило приёма, что эмпирически неоптимально.</w:t>
       </w:r>
@@ -3525,6 +3531,12 @@
           <w:szCs w:val="28"/>
         </w:rPr>
         <w:t xml:space="preserve">Принципиальное ограничение существующих подходов состоит в том, что и длина черновика, и порог верификации, как правило, задаются фиксированными гиперпараметрами, подобранными по усреднённому поведению на валидационной выборке. Между тем оптимальная длина черновика и допустимая степень ослабления проверки зависят от текущего состояния генерации: на «лёгких» участках (типовые окончания, синтаксически предопределённые позиции) выгодны длинный черновик и мягкая проверка, на «трудных» (выбор числа в арифметической задаче, начало нового шага рассуждения) – короткий черновик и строгая проверка. Любое </w:t>
+      </w:r>
+      <w:r>
+        <w:rPr>
+          <w:sz w:val="28"/>
+          <w:szCs w:val="28"/>
+        </w:rPr>
         <w:lastRenderedPageBreak/>
         <w:t>фиксированное значение оказывается компромиссом, не оптимальным ни для одного конкретного состояния. Более того, последовательное (каскадное) применение двух одномерных адаптивных правил не имеет гарантий оптимальности: оптимальное значение одного параметра функционально зависит от значения другого, поэтому оси нельзя оптимизировать порознь без потери совместного оптимума.</w:t>
       </w:r>
@@ -3623,6 +3635,12 @@
           <w:szCs w:val="28"/>
         </w:rPr>
         <w:t xml:space="preserve">Объектом исследования выступает процесс инференса авторегрессионных больших языковых моделей со спекулятивным декодированием. Предметом исследования являются методы совместной </w:t>
+      </w:r>
+      <w:r>
+        <w:rPr>
+          <w:sz w:val="28"/>
+          <w:szCs w:val="28"/>
+        </w:rPr>
         <w:lastRenderedPageBreak/>
         <w:t>адаптивной оптимизации длины черновика и порога верификации, а также их теоретические свойства и эмпирическая эффективность.</w:t>
       </w:r>
@@ -4604,6 +4622,12 @@
           <w:szCs w:val="28"/>
         </w:rPr>
         <w:t xml:space="preserve">Авторегрессионная генерация ответа длины n требует n последовательных прямых проходов (forward pass) по целевой модели. В отличие от стадии обработки промпта (prefill), где все входные токены </w:t>
+      </w:r>
+      <w:r>
+        <w:rPr>
+          <w:sz w:val="28"/>
+          <w:szCs w:val="28"/>
+        </w:rPr>
         <w:lastRenderedPageBreak/>
         <w:t>проходят через модель одним параллельным проходом, стадия декодирования (decode) принципиально последовательна: распараллелить её на уровне токенов в рамках стандартного подхода невозможно, поскольку вход очередного шага есть выход предыдущего. Это ограничение принято называть последовательным узким местом декодирования (sequential decode bottleneck).</w:t>
       </w:r>
@@ -4696,6 +4720,12 @@
           <w:szCs w:val="28"/>
         </w:rPr>
         <w:t xml:space="preserve">Чтобы на каждом шаге не пересчитывать представления всего префикса заново, используется кэш ключей и значений (key-value cache, KV-cache): </w:t>
+      </w:r>
+      <w:r>
+        <w:rPr>
+          <w:sz w:val="28"/>
+          <w:szCs w:val="28"/>
+        </w:rPr>
         <w:lastRenderedPageBreak/>
         <w:t>векторы ключей и значений механизма внимания, вычисленные для уже обработанных токенов, сохраняются и переиспользуются на последующих шагах. Кэширование снижает арифметическую сложность шага декодирования с квадратичной до линейной по длине префикса, однако порождает иное ограничение.</w:t>
       </w:r>
@@ -4808,6 +4838,12 @@
           <w:szCs w:val="28"/>
         </w:rPr>
         <w:t xml:space="preserve">Спекулятивное декодирование (speculative decoding, SD) ускоряет инференс, вводя в схему вторую, существенно более дешёвую модель [10, 4]. Целевая модель (target model) с распределением p – это та модель, выборку из которой требуется получить; обычно она велика (единицы–десятки миллиардов параметров) и определяет качество. Черновая модель (draft model) с распределением q меньше на один–два порядка и служит для дешёвого </w:t>
+      </w:r>
+      <w:r>
+        <w:rPr>
+          <w:sz w:val="28"/>
+          <w:szCs w:val="28"/>
+        </w:rPr>
         <w:lastRenderedPageBreak/>
         <w:t>выдвижения гипотез. Верификатор (verifier) – процедура, которая по предложенным черновиком токенам и распределениям обеих моделей решает, какие из них принять.</w:t>
       </w:r>
@@ -5526,7 +5562,94 @@
           <w:sz w:val="28"/>
           <w:szCs w:val="28"/>
         </w:rPr>
-        <w:t>Если кандидат отклонён, на его позиции токен пересемплируется из нормированного остаточного распределения с плотностью, пропорциональной (p − q)_+ = max(0, p − q), а оставшиеся кандидаты блока отбрасываются. Можно показать, что при таком правиле итоговое распределение принятого (или пересемплированного) токена в точности совпадает с распределением целевой модели p. Тем самым спекулятивное декодирование является не приближённым, а точным методом: оно ускоряет генерацию, не меняя порождаемого распределения. Это утверждение, которое принято называть свойством точности спекулятивного декодирования, доказывается индукцией по числу токенов блока с использованием марковости процесса генерации; полное доказательство вынесено в приложение А. Схема одного цикла приведена на рисунке 1.1.</w:t>
+        <w:t xml:space="preserve">Если кандидат отклонён, на его позиции токен пересемплируется из нормированного остаточного распределения с плотностью, пропорциональной </w:t>
+      </w:r>
+      <m:oMath>
+        <m:sSub>
+          <m:sSubPr>
+            <m:ctrlPr>
+              <w:rPr>
+                <w:rFonts w:ascii="Cambria Math" w:hAnsi="Cambria Math"/>
+                <w:i/>
+                <w:sz w:val="28"/>
+                <w:szCs w:val="28"/>
+              </w:rPr>
+            </m:ctrlPr>
+          </m:sSubPr>
+          <m:e>
+            <m:d>
+              <m:dPr>
+                <m:ctrlPr>
+                  <w:rPr>
+                    <w:rFonts w:ascii="Cambria Math" w:hAnsi="Cambria Math"/>
+                    <w:i/>
+                    <w:sz w:val="28"/>
+                    <w:szCs w:val="28"/>
+                  </w:rPr>
+                </m:ctrlPr>
+              </m:dPr>
+              <m:e>
+                <m:r>
+                  <w:rPr>
+                    <w:rFonts w:ascii="Cambria Math" w:hAnsi="Cambria Math"/>
+                    <w:sz w:val="28"/>
+                    <w:szCs w:val="28"/>
+                  </w:rPr>
+                  <m:t xml:space="preserve">p </m:t>
+                </m:r>
+                <m:r>
+                  <w:rPr>
+                    <w:rFonts w:ascii="Cambria Math" w:hAnsi="Cambria Math"/>
+                    <w:sz w:val="28"/>
+                    <w:szCs w:val="28"/>
+                  </w:rPr>
+                  <m:t>–</m:t>
+                </m:r>
+                <m:r>
+                  <w:rPr>
+                    <w:rFonts w:ascii="Cambria Math" w:hAnsi="Cambria Math"/>
+                    <w:sz w:val="28"/>
+                    <w:szCs w:val="28"/>
+                  </w:rPr>
+                  <m:t xml:space="preserve"> q</m:t>
+                </m:r>
+              </m:e>
+            </m:d>
+          </m:e>
+          <m:sub>
+            <m:r>
+              <w:rPr>
+                <w:rFonts w:ascii="Cambria Math" w:hAnsi="Cambria Math"/>
+                <w:sz w:val="28"/>
+                <w:szCs w:val="28"/>
+              </w:rPr>
+              <m:t>+</m:t>
+            </m:r>
+          </m:sub>
+        </m:sSub>
+      </m:oMath>
+      <w:r>
+        <w:rPr>
+          <w:sz w:val="28"/>
+          <w:szCs w:val="28"/>
+        </w:rPr>
+        <w:t xml:space="preserve"> = </w:t>
+      </w:r>
+      <w:proofErr w:type="gramStart"/>
+      <w:r>
+        <w:rPr>
+          <w:sz w:val="28"/>
+          <w:szCs w:val="28"/>
+        </w:rPr>
+        <w:t>max(</w:t>
+      </w:r>
+      <w:proofErr w:type="gramEnd"/>
+      <w:r>
+        <w:rPr>
+          <w:sz w:val="28"/>
+          <w:szCs w:val="28"/>
+        </w:rPr>
+        <w:t>0, p − q), а оставшиеся кандидаты блока отбрасываются. Можно показать, что при таком правиле итоговое распределение принятого (или пересемплированного) токена в точности совпадает с распределением целевой модели p. Тем самым спекулятивное декодирование является не приближённым, а точным методом: оно ускоряет генерацию, не меняя порождаемого распределения. Это утверждение, которое принято называть свойством точности спекулятивного декодирования, доказывается индукцией по числу токенов блока с использованием марковости процесса генерации; полное доказательство вынесено в приложение А. Схема одного цикла приведена на рисунке 1.1.</w:t>
       </w:r>
     </w:p>
     <w:p>
@@ -5969,6 +6092,12 @@
           <w:szCs w:val="28"/>
         </w:rPr>
         <w:t xml:space="preserve">Из формулы (1.3) вытекает и теоретический потолок ускорения точного спекулятивного декодирования. При α → 1 множитель E[β] стремится к γ + 1, и коэффициент ускорения приближается к (γ + 1) / (1 + γc), что при больших γ не превосходит 1/c – обратной величины относительной стоимости чернового </w:t>
+      </w:r>
+      <w:r>
+        <w:rPr>
+          <w:sz w:val="28"/>
+          <w:szCs w:val="28"/>
+        </w:rPr>
         <w:lastRenderedPageBreak/>
         <w:t>прохода. Преодолеть этот потолок, оставаясь в классе точных методов, невозможно: дальнейший выигрыш достижим либо повышением согласованности α за счёт более удачной черновой модели, либо контролируемым ослаблением правила приёма, которое рассматривается в разделе 1.3.</w:t>
       </w:r>
@@ -6439,6 +6568,12 @@
           <w:szCs w:val="28"/>
         </w:rPr>
         <w:t xml:space="preserve">Множество достижимых пар «пропускная способность – качество» при изменении T образует границу Парето: ни одну из двух величин нельзя улучшить, не ухудшив другую. Теоретическую структуру этой границы для семейств методов с параметризованным ослаблением верификации исследовали Yin и соавторы [18], показавшие, что при разумных </w:t>
+      </w:r>
+      <w:r>
+        <w:rPr>
+          <w:sz w:val="28"/>
+          <w:szCs w:val="28"/>
+        </w:rPr>
         <w:lastRenderedPageBreak/>
         <w:t>предположениях фронт монотонен. Настоящая работа опирается на этот результат дважды: как на язык описания компромисса (раздел 4) и как на ориентир для скаляризации двухкритериальной задачи управления (раздел 2).</w:t>
       </w:r>
@@ -6683,6 +6818,12 @@
           <w:szCs w:val="28"/>
         </w:rPr>
         <w:t xml:space="preserve">Метод SpecExec [15] увеличивает число подтверждаемых за цикл токенов, переходя от линейного черновика к дереву кандидатов. Черновая модель строит префиксное дерево наиболее вероятных продолжений, целевая модель проверяет все ветви одним проходом с переиспользованием KV-кэша вдоль рёбер дерева, после чего выбирается наилучший допустимый путь. За счёт пакетного внимания верификация дерева стоит примерно столько же, сколько верификация линейной цепочки той же глубины, тогда как ожидаемое число принятых токенов выше. SpecExec сохраняет точное распределение целевой модели и особенно эффективен при больших бюджетах параллелизма, </w:t>
+      </w:r>
+      <w:r>
+        <w:rPr>
+          <w:sz w:val="28"/>
+          <w:szCs w:val="28"/>
+        </w:rPr>
         <w:lastRenderedPageBreak/>
         <w:t>однако управляет структурой дерева, а не порогом приёма, и потому ортогонален оси верификации.</w:t>
       </w:r>
@@ -6759,6 +6900,12 @@
           <w:szCs w:val="28"/>
         </w:rPr>
         <w:t xml:space="preserve">Перечисленные подходы различаются балансом между ростом согласованности α и ростом относительной стоимости c. Medusa почти не увеличивает c (головы дёшевы), но прирост α ограничен независимостью голов; EAGLE на уровне скрытых представлений достигает большего α ценой обучения авторегрессионной черновой сети, а версия EAGLE-3 дополнительно улучшает обучение и архитектуру по сравнению с ранними EAGLE-1 и EAGLE-2. Kangaroo и LayerSkip переиспользуют слои самой целевой модели, снижая c за счёт более тесной связи с целью. Для настоящей работы существенно, что любой из этих механизмов лишь смещает рабочую точку (α, </w:t>
+      </w:r>
+      <w:r>
+        <w:rPr>
+          <w:sz w:val="28"/>
+          <w:szCs w:val="28"/>
+        </w:rPr>
         <w:lastRenderedPageBreak/>
         <w:t>c), не затрагивая управление парой (длина, порог), и потому сочетается с предлагаемым методом, а не конкурирует с ним.</w:t>
       </w:r>
@@ -6877,6 +7024,12 @@
           <w:szCs w:val="28"/>
         </w:rPr>
         <w:t xml:space="preserve">Зеркально к предыдущей группе действуют методы, фиксирующие длину черновика и управляющие осью верификации. Fuzzy SD [7] вводит скалярный порог приёма T (подраздел 1.3.1), переводящий метод в lossy-режим; MARS обобщает эту идею через matched acceptance rule, настраивая степень ослабления по локальным признакам распределения целевой модели. MARS – наиболее близкий к настоящей работе метод по оси верификации; принципиальное отличие предлагаемого подхода в том, что порог T </w:t>
+      </w:r>
+      <w:r>
+        <w:rPr>
+          <w:sz w:val="28"/>
+          <w:szCs w:val="28"/>
+        </w:rPr>
         <w:lastRenderedPageBreak/>
         <w:t>оптимизируется не изолированно, а совместно с длиной γ. Теоретическую рамку для всей группы задаёт результат Yin и соавторов [18] о структуре границы Парето между ускорением и расхождением распределений: при разумных предположениях фронт монотонен, что и обосновывает скаляризацию двухкритериальной задачи через множитель Лагранжа в разделе 2.</w:t>
       </w:r>
@@ -7274,6 +7427,12 @@
           <w:szCs w:val="28"/>
         </w:rPr>
         <w:t xml:space="preserve">Таблица 1.1 делает пробел явным. Ячейка на пересечении адаптивного управления длиной и ослабленной адаптивной верификации остаётся незаполненной: ни одна из рассмотренных работ не управляет обеими осями совместно как связанными переменными единой оптимизационной задачи. Частные комбинации встречаются (например, адаптивную длину применяют поверх фиксированного порога Fuzzy SD), однако такое каскадное сочетание </w:t>
+      </w:r>
+      <w:r>
+        <w:rPr>
+          <w:sz w:val="28"/>
+          <w:szCs w:val="28"/>
+        </w:rPr>
         <w:lastRenderedPageBreak/>
         <w:t>не обеспечивает совместного оптимума, поскольку оптимальное значение одного параметра функционально зависит от другого. Именно эту нишу занимает предлагаемый метод JointAdaSpec, причём, в отличие от AutoJudge, Medusa и EAGLE, он не требует обучения нейросетевых модулей – управляющая политика хранится в виде таблицы.</w:t>
       </w:r>
@@ -7905,6 +8064,12 @@
           <w:szCs w:val="28"/>
         </w:rPr>
         <w:t xml:space="preserve">Удобно ввести функцию ценности действия (Q-функцию): величина Q*(s, a) складывается из мгновенной награды r(s, a) и дисконтированной </w:t>
+      </w:r>
+      <w:r>
+        <w:rPr>
+          <w:sz w:val="28"/>
+          <w:szCs w:val="28"/>
+        </w:rPr>
         <w:lastRenderedPageBreak/>
         <w:t>ожидаемой ценности следующего состояния. Оптимальное действие в состоянии s доставляет максимум Q*(s, a) по действиям a; тем самым, зная V*, политику извлекают жадно. Применительно к спекулятивному декодированию состояние описывает текущую ситуацию генерации, а действие – выбор длины черновика и порога, что и превращает задачу адаптивного управления в задачу решения MDP. Оговорим коллизию обозначений: символ γ традиционно используют и для длины черновика (разделы 1.2–1.4), и для коэффициента дисконтирования (настоящий раздел). Во избежание неоднозначности при построении MDP-формулировки JointAdaSpec в разделе 2 коэффициент дисконтирования переобозначается через λ, а γ сохраняется за длиной черновика.</w:t>
       </w:r>
@@ -8580,6 +8745,12 @@
           <w:szCs w:val="28"/>
         </w:rPr>
         <w:t xml:space="preserve">Для многих прикладных MDP оптимальная политика имеет регулярную структуру: если состояния и действия упорядочены, а награда и переходы удовлетворяют условиям монотонности и супермодулярности [16], то оптимальное действие монотонно по состоянию, а сама политика приобретает пороговый вид – действие меняется при пересечении некоторой границы в пространстве состояний [12]. Пороговые политики удобны и вычислительно, и интерпретационно; именно к ним сводятся одномерные адаптивные методы из подраздела 1.4.4: SVIP и AdaEDL реализуют пороговое правило в координате энтропии чернового распределения, SpecDec++ – в координате обучаемой оценки вероятности принятия. Настоящая работа обобщает эту одномерную пороговую структуру на двумерное управление парой (длина, порог). Вместе с тем выполнение условий супермодулярности не гарантировано: при их нарушении пороговая – а значит, и каскадная, рассматривающая оси по очереди – структура перестаёт быть оптимальной. </w:t>
+      </w:r>
+      <w:r>
+        <w:rPr>
+          <w:sz w:val="28"/>
+          <w:szCs w:val="28"/>
+        </w:rPr>
         <w:lastRenderedPageBreak/>
         <w:t>Проверка этих условий и количественная оценка последствий их нарушения составляют предмет теоретического анализа во втором разделе.</w:t>
       </w:r>
@@ -8733,6 +8904,12 @@
           <w:szCs w:val="28"/>
         </w:rPr>
         <w:t xml:space="preserve">Предлагаемый подход состоит в том, чтобы трактовать выбор пары (длина черновика, порог верификации) на каждом цикле декодирования как действие в марковском процессе принятия решений, состояние которого описывает текущую ситуацию генерации (уверенность черновика, накопленное расхождение моделей, позицию в блоке). Оптимальная политика такого MDP по построению учитывает связь осей: она назначает совместно оптимальную пару (γ, T) для каждого состояния. Каскадные эвристики при этом оказываются частным случаем – подмножеством совместных политик, – что позволяет строго сравнить их с совместным решением. Такой взгляд </w:t>
+      </w:r>
+      <w:r>
+        <w:rPr>
+          <w:sz w:val="28"/>
+          <w:szCs w:val="28"/>
+        </w:rPr>
         <w:lastRenderedPageBreak/>
         <w:t>переводит инженерную задачу подбора гиперпараметров в задачу оптимального управления с доказуемыми свойствами.</w:t>
       </w:r>
@@ -9977,7 +10154,59 @@
           <w:sz w:val="28"/>
           <w:szCs w:val="28"/>
         </w:rPr>
-        <w:t>Если энтропия H характеризует абсолютную неуверенность черновой модели, то K характеризует именно расхождение распределений. Высокое K при низком H отвечает ситуации «черновик уверен, но неверно»: точное правило (1.2) отвергнет такой токен с высокой вероятностью. Совместное наблюдение пары (H, K) несёт существенно больше информации о предстоящем принятии, чем любая одномерная статистика. Использовано направление KL(q ‖ p), а не обратное: кандидаты выбираются из q, поэтому расхождение «q относительно p» точнее предсказывает поведение верификации. Верхняя граница K_max = 8,0 нат.</w:t>
+        <w:t xml:space="preserve">Если энтропия H характеризует абсолютную неуверенность черновой модели, то K характеризует именно расхождение распределений. Высокое K при низком H отвечает ситуации «черновик уверен, но неверно»: точное правило (1.2) отвергнет такой токен с высокой вероятностью. Совместное наблюдение пары (H, K) несёт существенно больше информации о предстоящем принятии, чем любая одномерная статистика. Использовано направление KL(q ‖ p), а не обратное: кандидаты выбираются из q, поэтому расхождение «q относительно p» точнее предсказывает поведение верификации. Верхняя граница </w:t>
+      </w:r>
+      <m:oMath>
+        <m:sSub>
+          <m:sSubPr>
+            <m:ctrlPr>
+              <w:rPr>
+                <w:rFonts w:ascii="Cambria Math" w:hAnsi="Cambria Math"/>
+                <w:i/>
+                <w:sz w:val="28"/>
+                <w:szCs w:val="28"/>
+              </w:rPr>
+            </m:ctrlPr>
+          </m:sSubPr>
+          <m:e>
+            <m:r>
+              <w:rPr>
+                <w:rFonts w:ascii="Cambria Math" w:hAnsi="Cambria Math"/>
+                <w:sz w:val="28"/>
+                <w:szCs w:val="28"/>
+              </w:rPr>
+              <m:t>K</m:t>
+            </m:r>
+          </m:e>
+          <m:sub>
+            <m:r>
+              <m:rPr>
+                <m:sty m:val="p"/>
+              </m:rPr>
+              <w:rPr>
+                <w:rFonts w:ascii="Cambria Math" w:hAnsi="Cambria Math"/>
+                <w:sz w:val="28"/>
+                <w:szCs w:val="28"/>
+              </w:rPr>
+              <m:t>m</m:t>
+            </m:r>
+            <m:r>
+              <w:rPr>
+                <w:rFonts w:ascii="Cambria Math" w:hAnsi="Cambria Math"/>
+                <w:sz w:val="28"/>
+                <w:szCs w:val="28"/>
+              </w:rPr>
+              <m:t>ax</m:t>
+            </m:r>
+          </m:sub>
+        </m:sSub>
+      </m:oMath>
+      <w:r>
+        <w:rPr>
+          <w:sz w:val="28"/>
+          <w:szCs w:val="28"/>
+        </w:rPr>
+        <w:t>= 8,0 нат.</w:t>
       </w:r>
     </w:p>
     <w:p>
@@ -10009,9 +10238,49 @@
           <w:sz w:val="28"/>
           <w:szCs w:val="28"/>
         </w:rPr>
-        <w:t xml:space="preserve">Позиция в черновике k. Дискретный счётчик уже сгенерированных в текущем блоке токенов необходим по двум содержательным причинам. </w:t>
         <w:lastRenderedPageBreak/>
-        <w:t xml:space="preserve">Маргинальная выгода от продолжения черновика падает с ростом k в силу геометрического убывания вероятности достичь позиции k + 1, а верхняя граница γ_max создаёт жёсткое ограничение, которое политика обязана учитывать, чтобы не выродиться в правило «продолжать всегда». Без k процесс перестаёт быть марковским. Принято </w:t>
+        <w:t xml:space="preserve">Позиция в черновике k. Дискретный счётчик уже сгенерированных в текущем блоке токенов необходим по двум содержательным причинам. Маргинальная выгода от продолжения черновика падает с ростом k в силу геометрического убывания вероятности достичь позиции k + 1, а верхняя граница </w:t>
+      </w:r>
+      <m:oMath>
+        <m:sSub>
+          <m:sSubPr>
+            <m:ctrlPr>
+              <w:rPr>
+                <w:rFonts w:ascii="Cambria Math" w:hAnsi="Cambria Math"/>
+                <w:i/>
+                <w:sz w:val="28"/>
+                <w:szCs w:val="28"/>
+              </w:rPr>
+            </m:ctrlPr>
+          </m:sSubPr>
+          <m:e>
+            <m:r>
+              <w:rPr>
+                <w:rFonts w:ascii="Cambria Math" w:hAnsi="Cambria Math"/>
+                <w:sz w:val="28"/>
+                <w:szCs w:val="28"/>
+              </w:rPr>
+              <m:t>γ</m:t>
+            </m:r>
+          </m:e>
+          <m:sub>
+            <m:r>
+              <w:rPr>
+                <w:rFonts w:ascii="Cambria Math" w:hAnsi="Cambria Math"/>
+                <w:sz w:val="28"/>
+                <w:szCs w:val="28"/>
+              </w:rPr>
+              <m:t>max</m:t>
+            </m:r>
+          </m:sub>
+        </m:sSub>
+      </m:oMath>
+      <w:r>
+        <w:rPr>
+          <w:sz w:val="28"/>
+          <w:szCs w:val="28"/>
+        </w:rPr>
+        <w:t xml:space="preserve">здаёт жёсткое ограничение, которое политика обязана учитывать, чтобы не выродиться в правило «продолжать всегда». Без k процесс перестаёт быть марковским. Принято </w:t>
       </w:r>
       <m:oMath>
         <m:sSub>
@@ -11049,9 +11318,8 @@
           <w:sz w:val="28"/>
           <w:szCs w:val="28"/>
         </w:rPr>
-        <w:t xml:space="preserve">Геометрическая сетка выбрана потому, что влияние порога на вероятность принятия мультипликативно: переход от T = 1 к T = 1,1 и переход </w:t>
         <w:lastRenderedPageBreak/>
-        <w:t xml:space="preserve">от T = 5 к T = 5,5 содержательно различны. При </w:t>
+        <w:t xml:space="preserve">Геометрическая сетка выбрана потому, что влияние порога на вероятность принятия мультипликативно: переход от T = 1 к T = 1,1 и переход от T = 5 к T = 5,5 содержательно различны. При </w:t>
       </w:r>
       <m:oMath>
         <m:sSub>
@@ -11529,9 +11797,15 @@
           <w:sz w:val="28"/>
           <w:szCs w:val="28"/>
         </w:rPr>
-        <w:t xml:space="preserve"> сводится к stop) и переход к началу нового блока после верификации. Существенное для теоремы 2.3 условие стохастической монотонности (C2) содержательно означает, что сдвиг текущего состояния к большим (H, K) делает более вероятным и большее (H′, K′) следующего состояния. Эта монотонность отражает локальную автокоррелированность сложности текста: высокая неуверенность черновика в текущей позиции </w:t>
+        <w:t xml:space="preserve"> сводится к stop) и переход к началу нового блока после верификации. Существенное для теоремы 2.3 условие стохастической монотонности (C2) содержательно означает, что сдвиг текущего состояния к большим (H, K) делает более вероятным и большее (H′, K′) следующего </w:t>
+      </w:r>
+      <w:r>
+        <w:rPr>
+          <w:sz w:val="28"/>
+          <w:szCs w:val="28"/>
+        </w:rPr>
         <w:lastRenderedPageBreak/>
-        <w:t>свидетельствует о локально сложном участке последовательности. Эмпирическая проверка условий монотонности вынесена в подраздел 4.x.</w:t>
+        <w:t>состояния. Эта монотонность отражает локальную автокоррелированность сложности текста: высокая неуверенность черновика в текущей позиции свидетельствует о локально сложном участке последовательности. Эмпирическая проверка условий монотонности вынесена в подраздел 4.x.</w:t>
       </w:r>
     </w:p>
     <w:p>
@@ -12389,7 +12663,15 @@
           <w:sz w:val="28"/>
           <w:szCs w:val="28"/>
         </w:rPr>
-        <w:t xml:space="preserve"> = 0,01, а потеря качества – слагаемым с множителем κ. Аддитивный штраф качества, согласующийся с теоремой B, параметризуется коэффициентами при дивергенции K и позиции k (поля </w:t>
+        <w:t xml:space="preserve"> = 0,01, а потеря качества – слагаемым с множителем κ. Аддитивный штраф качества, согласующийся с теоремой B, параметризуется </w:t>
+      </w:r>
+      <w:r>
+        <w:rPr>
+          <w:sz w:val="28"/>
+          <w:szCs w:val="28"/>
+        </w:rPr>
+        <w:lastRenderedPageBreak/>
+        <w:t xml:space="preserve">коэффициентами при дивергенции K и позиции k (поля </w:t>
       </w:r>
       <m:oMath>
         <m:r>
@@ -12551,9 +12833,7 @@
           <w:sz w:val="28"/>
           <w:szCs w:val="28"/>
         </w:rPr>
-        <w:t xml:space="preserve"> конфигурации); по умолчанию оба равны нулю, что соответствует </w:t>
-        <w:lastRenderedPageBreak/>
-        <w:t xml:space="preserve">базовой постановке (2.8). Малое </w:t>
+        <w:t xml:space="preserve"> конфигурации); по умолчанию оба равны нулю, что соответствует базовой постановке (2.8). Малое </w:t>
       </w:r>
       <m:oMath>
         <m:sSub>
@@ -13508,6 +13788,7 @@
             <w:sz w:val="28"/>
             <w:szCs w:val="28"/>
           </w:rPr>
+          <w:lastRenderedPageBreak/>
           <m:t>δ</m:t>
         </m:r>
       </m:oMath>
@@ -13532,24 +13813,105 @@
           <w:sz w:val="28"/>
           <w:szCs w:val="28"/>
         </w:rPr>
-        <w:lastRenderedPageBreak/>
-        <w:t>Первое слагаемое – статистическая ошибка (концентрация Хёфдинга по выборке переходов), убывающая как корень из числа наблюдений; второе – смещение, вносимое сглаживанием Лапласа и убывающее с ростом n_min. Практический вывод: для контроля ошибки достаточно гарантировать минимальную заполненность каждой пары (состояние, действие) в трейсах, что и закладывается в процедуру сбора (2.3).</w:t>
-      </w:r>
-    </w:p>
-    <w:p>
-      <w:pPr>
-        <w:ind w:firstLine="709"/>
-        <w:rPr>
-          <w:sz w:val="28"/>
-          <w:szCs w:val="28"/>
-        </w:rPr>
-      </w:pPr>
-      <w:r>
-        <w:rPr>
-          <w:sz w:val="28"/>
-          <w:szCs w:val="28"/>
-        </w:rPr>
-        <w:t>Идея доказательства. Для фиксированной пары (s, a) оценка функции переходов есть нормированный счётчик наблюдений, и по неравенству Хёфдинга её отклонение от истинного распределения убывает как корень из числа наблюдений. Объединение оценок по всем |S| · |A| парам (union bound) даёт логарифмический множитель ln(2|S| · |A| / δ). Перенос ошибки оценки переходов на ошибку функции ценности опирается на λ-сжимаемость оператора Беллмана и вносит множитель 1 / (1 − λ)²: одна степень отвечает за горизонт планирования, вторая – за накопление ошибки вдоль итераций. Смещение от сглаживания Лапласа учитывается отдельным слагаемым, линейным по α и убывающим с ростом n_min. Полные выкладки приведены в приложении А.</w:t>
+        <w:t xml:space="preserve">Первое слагаемое – статистическая ошибка (концентрация Хёфдинга по выборке переходов), убывающая как корень из числа наблюдений; второе – смещение, вносимое сглаживанием Лапласа и убывающее с ростом </w:t>
+      </w:r>
+      <m:oMath>
+        <m:sSub>
+          <m:sSubPr>
+            <m:ctrlPr>
+              <w:rPr>
+                <w:rFonts w:ascii="Cambria Math" w:hAnsi="Cambria Math"/>
+                <w:i/>
+                <w:sz w:val="28"/>
+                <w:szCs w:val="28"/>
+              </w:rPr>
+            </m:ctrlPr>
+          </m:sSubPr>
+          <m:e>
+            <m:r>
+              <w:rPr>
+                <w:rFonts w:ascii="Cambria Math" w:hAnsi="Cambria Math"/>
+                <w:sz w:val="28"/>
+                <w:szCs w:val="28"/>
+              </w:rPr>
+              <m:t>n</m:t>
+            </m:r>
+          </m:e>
+          <m:sub>
+            <m:r>
+              <w:rPr>
+                <w:rFonts w:ascii="Cambria Math" w:hAnsi="Cambria Math"/>
+                <w:sz w:val="28"/>
+                <w:szCs w:val="28"/>
+              </w:rPr>
+              <m:t>min</m:t>
+            </m:r>
+          </m:sub>
+        </m:sSub>
+      </m:oMath>
+      <w:r>
+        <w:rPr>
+          <w:sz w:val="28"/>
+          <w:szCs w:val="28"/>
+        </w:rPr>
+        <w:t>рактический вывод: для контроля ошибки достаточно гарантировать минимальную заполненность каждой пары (состояние, действие) в трейсах, что и закладывается в процедуру сбора (2.3).</w:t>
+      </w:r>
+    </w:p>
+    <w:p>
+      <w:pPr>
+        <w:ind w:firstLine="709"/>
+        <w:rPr>
+          <w:sz w:val="28"/>
+          <w:szCs w:val="28"/>
+        </w:rPr>
+      </w:pPr>
+      <w:r>
+        <w:rPr>
+          <w:sz w:val="28"/>
+          <w:szCs w:val="28"/>
+        </w:rPr>
+        <w:t xml:space="preserve">Идея доказательства. Для фиксированной пары (s, a) оценка функции переходов есть нормированный счётчик наблюдений, и по неравенству Хёфдинга её отклонение от истинного распределения убывает как корень из числа наблюдений. Объединение оценок по всем |S| · |A| парам (union bound) даёт логарифмический множитель ln(2|S| · |A| / δ). Перенос ошибки оценки переходов на ошибку функции ценности опирается на λ-сжимаемость оператора Беллмана и вносит множитель 1 / (1 − λ)²: одна степень отвечает за горизонт планирования, вторая – за накопление ошибки вдоль итераций. Смещение от сглаживания Лапласа учитывается отдельным слагаемым, линейным по α и убывающим с ростом </w:t>
+      </w:r>
+      <m:oMath>
+        <m:sSub>
+          <m:sSubPr>
+            <m:ctrlPr>
+              <w:rPr>
+                <w:rFonts w:ascii="Cambria Math" w:hAnsi="Cambria Math"/>
+                <w:i/>
+                <w:sz w:val="28"/>
+                <w:szCs w:val="28"/>
+              </w:rPr>
+            </m:ctrlPr>
+          </m:sSubPr>
+          <m:e>
+            <m:r>
+              <w:rPr>
+                <w:rFonts w:ascii="Cambria Math" w:hAnsi="Cambria Math"/>
+                <w:sz w:val="28"/>
+                <w:szCs w:val="28"/>
+              </w:rPr>
+              <m:t>n</m:t>
+            </m:r>
+          </m:e>
+          <m:sub>
+            <m:r>
+              <w:rPr>
+                <w:rFonts w:ascii="Cambria Math" w:hAnsi="Cambria Math"/>
+                <w:sz w:val="28"/>
+                <w:szCs w:val="28"/>
+              </w:rPr>
+              <m:t>min</m:t>
+            </m:r>
+          </m:sub>
+        </m:sSub>
+      </m:oMath>
+      <w:r>
+        <w:rPr>
+          <w:sz w:val="28"/>
+          <w:szCs w:val="28"/>
+        </w:rPr>
+        <w:t>олные выкладки приведены в приложении А.</w:t>
       </w:r>
     </w:p>
     <w:p>
@@ -13663,6 +14025,12 @@
           <w:szCs w:val="28"/>
         </w:rPr>
         <w:t xml:space="preserve">, зависящий только от состояния. Тогда оптимальная политика MDP не изменяется: добавка сдвигает функцию ценности на постоянную по действиям величину и сокращается в операторе максимума. Форму </w:t>
+      </w:r>
+      <w:r>
+        <w:rPr>
+          <w:sz w:val="28"/>
+          <w:szCs w:val="28"/>
+        </w:rPr>
         <w:lastRenderedPageBreak/>
         <w:t xml:space="preserve">оптимальной политики способен изменить лишь штраф, связанный с действием, </w:t>
       </w:r>
@@ -16397,6 +16765,12 @@
           <w:szCs w:val="28"/>
         </w:rPr>
         <w:t xml:space="preserve">). По набору одношаговых переходов (s, a, r, s′), </w:t>
+      </w:r>
+      <w:r>
+        <w:rPr>
+          <w:sz w:val="28"/>
+          <w:szCs w:val="28"/>
+        </w:rPr>
         <w:lastRenderedPageBreak/>
         <w:t>собранных на удержанной части обучающих промптов, функция переходов оценивается частотно со сглаживанием Лапласа</w:t>
       </w:r>
@@ -17383,6 +17757,12 @@
           <w:szCs w:val="28"/>
         </w:rPr>
         <w:t xml:space="preserve">Совместная и каскадная политики решаются по одному и тому же набору трейсов, что обеспечивает корректность их сравнения в разделе 4. Детерминированность всего пайплайна (фиксированные начальные значения </w:t>
+      </w:r>
+      <w:r>
+        <w:rPr>
+          <w:sz w:val="28"/>
+          <w:szCs w:val="28"/>
+        </w:rPr>
         <w:lastRenderedPageBreak/>
         <w:t>генераторов, отсутствие обучаемых нейросетевых модулей) делает выученную политику воспроизводимой по тем же входным трейсам.</w:t>
       </w:r>
@@ -18397,7 +18777,128 @@
           <w:sz w:val="28"/>
           <w:szCs w:val="28"/>
         </w:rPr>
-        <w:t>Управление экспериментом построено на конфигурационном фреймворке Hydra: пара моделей, набор данных, размер сетки состояний и гиперпараметры награды задаются декларативно в YAML-файлах каталога configs/, что исключает разнесённость параметров по исходному коду. Центральная структура параметров MDP приведена в листинге 3.1; её поля дословно соответствуют величинам раздела 2 (H_max, K_max, γ_max, сетка 20 × 20, набор порогов T, дисконт λ, множитель κ, сглаживание α).</w:t>
+        <w:t>Управление экспериментом построено на конфигурационном фреймворке Hydra: пара моделей, набор данных, размер сетки состояний и гиперпараметры награды задаются декларативно в YAML-файлах каталога configs/, что исключает разнесённость параметров по исходному коду. Центральная структура параметров MDP приведена в листинге 3.1; её поля дословно соответствуют величинам раздела 2 (</w:t>
+      </w:r>
+      <m:oMath>
+        <m:sSub>
+          <m:sSubPr>
+            <m:ctrlPr>
+              <w:rPr>
+                <w:rFonts w:ascii="Cambria Math" w:hAnsi="Cambria Math"/>
+                <w:i/>
+                <w:sz w:val="28"/>
+                <w:szCs w:val="28"/>
+              </w:rPr>
+            </m:ctrlPr>
+          </m:sSubPr>
+          <m:e>
+            <m:r>
+              <w:rPr>
+                <w:rFonts w:ascii="Cambria Math" w:hAnsi="Cambria Math"/>
+                <w:sz w:val="28"/>
+                <w:szCs w:val="28"/>
+              </w:rPr>
+              <m:t>H</m:t>
+            </m:r>
+          </m:e>
+          <m:sub>
+            <m:r>
+              <w:rPr>
+                <w:rFonts w:ascii="Cambria Math" w:hAnsi="Cambria Math"/>
+                <w:sz w:val="28"/>
+                <w:szCs w:val="28"/>
+              </w:rPr>
+              <m:t>max</m:t>
+            </m:r>
+          </m:sub>
+        </m:sSub>
+        <m:r>
+          <w:rPr>
+            <w:rFonts w:ascii="Cambria Math" w:hAnsi="Cambria Math"/>
+            <w:sz w:val="28"/>
+            <w:szCs w:val="28"/>
+          </w:rPr>
+          <m:t xml:space="preserve">, </m:t>
+        </m:r>
+        <m:sSub>
+          <m:sSubPr>
+            <m:ctrlPr>
+              <w:rPr>
+                <w:rFonts w:ascii="Cambria Math" w:hAnsi="Cambria Math"/>
+                <w:i/>
+                <w:sz w:val="28"/>
+                <w:szCs w:val="28"/>
+              </w:rPr>
+            </m:ctrlPr>
+          </m:sSubPr>
+          <m:e>
+            <m:r>
+              <w:rPr>
+                <w:rFonts w:ascii="Cambria Math" w:hAnsi="Cambria Math"/>
+                <w:sz w:val="28"/>
+                <w:szCs w:val="28"/>
+              </w:rPr>
+              <m:t>K</m:t>
+            </m:r>
+          </m:e>
+          <m:sub>
+            <m:r>
+              <w:rPr>
+                <w:rFonts w:ascii="Cambria Math" w:hAnsi="Cambria Math"/>
+                <w:sz w:val="28"/>
+                <w:szCs w:val="28"/>
+              </w:rPr>
+              <m:t>max</m:t>
+            </m:r>
+          </m:sub>
+        </m:sSub>
+        <m:r>
+          <w:rPr>
+            <w:rFonts w:ascii="Cambria Math" w:hAnsi="Cambria Math"/>
+            <w:sz w:val="28"/>
+            <w:szCs w:val="28"/>
+          </w:rPr>
+          <m:t xml:space="preserve">, </m:t>
+        </m:r>
+        <m:sSub>
+          <m:sSubPr>
+            <m:ctrlPr>
+              <w:rPr>
+                <w:rFonts w:ascii="Cambria Math" w:hAnsi="Cambria Math"/>
+                <w:i/>
+                <w:sz w:val="28"/>
+                <w:szCs w:val="28"/>
+              </w:rPr>
+            </m:ctrlPr>
+          </m:sSubPr>
+          <m:e>
+            <m:r>
+              <w:rPr>
+                <w:rFonts w:ascii="Cambria Math" w:hAnsi="Cambria Math"/>
+                <w:sz w:val="28"/>
+                <w:szCs w:val="28"/>
+              </w:rPr>
+              <m:t>γ</m:t>
+            </m:r>
+          </m:e>
+          <m:sub>
+            <m:r>
+              <w:rPr>
+                <w:rFonts w:ascii="Cambria Math" w:hAnsi="Cambria Math"/>
+                <w:sz w:val="28"/>
+                <w:szCs w:val="28"/>
+              </w:rPr>
+              <m:t>max</m:t>
+            </m:r>
+          </m:sub>
+        </m:sSub>
+      </m:oMath>
+      <w:r>
+        <w:rPr>
+          <w:sz w:val="28"/>
+          <w:szCs w:val="28"/>
+        </w:rPr>
+        <w:t>0 × 20, набор порогов T, дисконт λ, множитель κ, сглаживание α).</w:t>
       </w:r>
     </w:p>
     <w:p>
@@ -18441,30 +18942,121 @@
           <w:szCs w:val="22"/>
         </w:rPr>
         <w:t>@dataclass(frozen=True)</w:t>
+      </w:r>
+      <w:r>
+        <w:rPr>
+          <w:rFonts w:ascii="Courier New" w:hAnsi="Courier New" w:cs="Courier New"/>
+          <w:sz w:val="22"/>
+          <w:szCs w:val="22"/>
+        </w:rPr>
         <w:br/>
         <w:t>class MDPConfig:</w:t>
+      </w:r>
+      <w:r>
+        <w:rPr>
+          <w:rFonts w:ascii="Courier New" w:hAnsi="Courier New" w:cs="Courier New"/>
+          <w:sz w:val="22"/>
+          <w:szCs w:val="22"/>
+        </w:rPr>
         <w:br/>
         <w:t xml:space="preserve">    H_max: float = 6.0          # верхняя граница энтропии H</w:t>
+      </w:r>
+      <w:r>
+        <w:rPr>
+          <w:rFonts w:ascii="Courier New" w:hAnsi="Courier New" w:cs="Courier New"/>
+          <w:sz w:val="22"/>
+          <w:szCs w:val="22"/>
+        </w:rPr>
         <w:br/>
         <w:t xml:space="preserve">    K_max: float = 8.0          # верхняя граница дивергенции K</w:t>
+      </w:r>
+      <w:r>
+        <w:rPr>
+          <w:rFonts w:ascii="Courier New" w:hAnsi="Courier New" w:cs="Courier New"/>
+          <w:sz w:val="22"/>
+          <w:szCs w:val="22"/>
+        </w:rPr>
         <w:br/>
         <w:t xml:space="preserve">    gamma_max: int = 8          # предельная длина черновика</w:t>
+      </w:r>
+      <w:r>
+        <w:rPr>
+          <w:rFonts w:ascii="Courier New" w:hAnsi="Courier New" w:cs="Courier New"/>
+          <w:sz w:val="22"/>
+          <w:szCs w:val="22"/>
+        </w:rPr>
         <w:br/>
         <w:t xml:space="preserve">    N_H: int = 20               # число бинов по оси H</w:t>
+      </w:r>
+      <w:r>
+        <w:rPr>
+          <w:rFonts w:ascii="Courier New" w:hAnsi="Courier New" w:cs="Courier New"/>
+          <w:sz w:val="22"/>
+          <w:szCs w:val="22"/>
+        </w:rPr>
         <w:br/>
         <w:t xml:space="preserve">    N_K: int = 20               # число бинов по оси K</w:t>
+      </w:r>
+      <w:r>
+        <w:rPr>
+          <w:rFonts w:ascii="Courier New" w:hAnsi="Courier New" w:cs="Courier New"/>
+          <w:sz w:val="22"/>
+          <w:szCs w:val="22"/>
+        </w:rPr>
         <w:br/>
         <w:t xml:space="preserve">    T_levels: tuple = (1.0, 1.22, 1.49, 1.82,</w:t>
+      </w:r>
+      <w:r>
+        <w:rPr>
+          <w:rFonts w:ascii="Courier New" w:hAnsi="Courier New" w:cs="Courier New"/>
+          <w:sz w:val="22"/>
+          <w:szCs w:val="22"/>
+        </w:rPr>
         <w:br/>
         <w:t xml:space="preserve">                       2.22, 2.71, 3.3, 4.0)   # сетка порогов</w:t>
+      </w:r>
+      <w:r>
+        <w:rPr>
+          <w:rFonts w:ascii="Courier New" w:hAnsi="Courier New" w:cs="Courier New"/>
+          <w:sz w:val="22"/>
+          <w:szCs w:val="22"/>
+        </w:rPr>
         <w:br/>
         <w:t xml:space="preserve">    lambda_discount: float = 0.99   # дисконт λ</w:t>
+      </w:r>
+      <w:r>
+        <w:rPr>
+          <w:rFonts w:ascii="Courier New" w:hAnsi="Courier New" w:cs="Courier New"/>
+          <w:sz w:val="22"/>
+          <w:szCs w:val="22"/>
+        </w:rPr>
         <w:br/>
         <w:t xml:space="preserve">    kappa: float = 1.0          # множитель Лагранжа κ</w:t>
+      </w:r>
+      <w:r>
+        <w:rPr>
+          <w:rFonts w:ascii="Courier New" w:hAnsi="Courier New" w:cs="Courier New"/>
+          <w:sz w:val="22"/>
+          <w:szCs w:val="22"/>
+        </w:rPr>
         <w:br/>
         <w:t xml:space="preserve">    alpha_smooth: float = 1.0   # сглаживание Лапласа</w:t>
+      </w:r>
+      <w:r>
+        <w:rPr>
+          <w:rFonts w:ascii="Courier New" w:hAnsi="Courier New" w:cs="Courier New"/>
+          <w:sz w:val="22"/>
+          <w:szCs w:val="22"/>
+        </w:rPr>
         <w:br/>
         <w:t xml:space="preserve">    nu_min: int = 5             # порог прямой оценки переходов</w:t>
+      </w:r>
+      <w:r>
+        <w:rPr>
+          <w:rFonts w:ascii="Courier New" w:hAnsi="Courier New" w:cs="Courier New"/>
+          <w:sz w:val="22"/>
+          <w:szCs w:val="22"/>
+        </w:rPr>
         <w:br/>
         <w:t xml:space="preserve">    quality_risk_form: str = "multiplicative"   # 'additive': теорема B</w:t>
       </w:r>
@@ -18492,6 +19084,12 @@
           <w:szCs w:val="28"/>
         </w:rPr>
         <w:t xml:space="preserve">Поток данных организован как линейный конвейер из четырёх стадий, изображённый на рисунке 3.1. Первая стадия (scripts/01_collect_traces.py) собирает трейсы спекулятивного декодирования на отложенной выборке промптов и сохраняет их в формате Parquet. Вторая (scripts/02_solve_mdp.py) оценивает функцию переходов и функцию награды, решает MDP методом итерации по ценности и сохраняет совместную политику вместе с двумя каскадными. Третья (scripts/03_benchmark.py) выполняет многосидовый бенчмарк против базовых методов и записывает результаты в JSONL. Четвёртая (scripts/04_verify_conditions.py) проверяет эмпирические условия </w:t>
+      </w:r>
+      <w:r>
+        <w:rPr>
+          <w:sz w:val="28"/>
+          <w:szCs w:val="28"/>
+        </w:rPr>
         <w:lastRenderedPageBreak/>
         <w:t>монотонности C1–C4 и невырожденности N1–N2 и строит диагностические графики; шаблоны из reports/templates строят по сохранённым артефактам Парето-диаграммы, пороговые поверхности и графики ablation.</w:t>
       </w:r>
@@ -18663,7 +19261,72 @@
           <w:szCs w:val="28"/>
         </w:rPr>
         <w:lastRenderedPageBreak/>
-        <w:t xml:space="preserve">Вычисление признаков вынесено в модуль core/features.py. Энтропия H и дивергенция K вычисляются в натах функциями entropy и kl_divergence, принимающими как логиты, так и уже нормированные распределения. Функция quantize отображает непрерывную тройку (H, K, k) в линейный индекс состояния: значения H и K обрезаются до диапазонов [0, </w:t>
+        <w:t xml:space="preserve">Вычисление признаков вынесено в модуль core/features.py. Энтропия H и дивергенция K вычисляются в натах функциями </w:t>
+      </w:r>
+      <w:proofErr w:type="spellStart"/>
+      <w:r>
+        <w:rPr>
+          <w:sz w:val="28"/>
+          <w:szCs w:val="28"/>
+        </w:rPr>
+        <w:t>entropy</w:t>
+      </w:r>
+      <w:proofErr w:type="spellEnd"/>
+      <w:r>
+        <w:rPr>
+          <w:sz w:val="28"/>
+          <w:szCs w:val="28"/>
+        </w:rPr>
+        <w:t xml:space="preserve"> и </w:t>
+      </w:r>
+      <m:oMath>
+        <m:r>
+          <w:rPr>
+            <w:rFonts w:ascii="Cambria Math" w:hAnsi="Cambria Math"/>
+            <w:sz w:val="28"/>
+            <w:szCs w:val="28"/>
+          </w:rPr>
+          <m:t>k</m:t>
+        </m:r>
+        <m:sSub>
+          <m:sSubPr>
+            <m:ctrlPr>
+              <w:rPr>
+                <w:rFonts w:ascii="Cambria Math" w:hAnsi="Cambria Math"/>
+                <w:i/>
+                <w:sz w:val="28"/>
+                <w:szCs w:val="28"/>
+              </w:rPr>
+            </m:ctrlPr>
+          </m:sSubPr>
+          <m:e>
+            <m:r>
+              <w:rPr>
+                <w:rFonts w:ascii="Cambria Math" w:hAnsi="Cambria Math"/>
+                <w:sz w:val="28"/>
+                <w:szCs w:val="28"/>
+              </w:rPr>
+              <m:t>l</m:t>
+            </m:r>
+          </m:e>
+          <m:sub>
+            <m:r>
+              <w:rPr>
+                <w:rFonts w:ascii="Cambria Math" w:hAnsi="Cambria Math"/>
+                <w:sz w:val="28"/>
+                <w:szCs w:val="28"/>
+              </w:rPr>
+              <m:t>divergence</m:t>
+            </m:r>
+          </m:sub>
+        </m:sSub>
+      </m:oMath>
+      <w:r>
+        <w:rPr>
+          <w:sz w:val="28"/>
+          <w:szCs w:val="28"/>
+        </w:rPr>
+        <w:t xml:space="preserve">, принимающими как логиты, так и уже нормированные распределения. Функция quantize отображает непрерывную тройку (H, K, k) в линейный индекс состояния: значения H и K обрезаются до диапазонов [0, </w:t>
       </w:r>
       <m:oMath>
         <m:sSub>
@@ -18835,24 +19498,177 @@
           <w:szCs w:val="28"/>
         </w:rPr>
         <w:t xml:space="preserve">Оценка параметров MDP и его решение разнесены по двум модулям. Модуль jointadaspec/mdp/estimation.py по множеству собранных переходов строит разреженную матрицу переходов формы (|S| · |A|) × |S|, таблицу ожидаемых наград и счётчик посещений. Когда число наблюдений пары </w:t>
+      </w:r>
+      <w:r>
+        <w:rPr>
+          <w:sz w:val="28"/>
+          <w:szCs w:val="28"/>
+        </w:rPr>
         <w:lastRenderedPageBreak/>
-        <w:t>«состояние – действие» не меньше порога nu_min, используется прямая эмпирическая оценка распределения переходов; при меньшем числе наблюдений к оценке добавляется аддитивное сглаживание Лапласа с коэффициентом alpha_smooth по формуле (2.14). Разреженное представление оправдано структурой задачи: из любого состояния достижимо лишь небольшое число соседних, поэтому матрица переходов содержит порядка одного процента ненулевых элементов.</w:t>
-      </w:r>
-    </w:p>
-    <w:p>
-      <w:pPr>
-        <w:ind w:firstLine="709"/>
-        <w:rPr>
-          <w:sz w:val="28"/>
-          <w:szCs w:val="28"/>
-        </w:rPr>
-      </w:pPr>
-      <w:r>
-        <w:rPr>
-          <w:sz w:val="28"/>
-          <w:szCs w:val="28"/>
-        </w:rPr>
-        <w:t>Модуль jointadaspec/mdp/value_iteration.py решает MDP разреженной реализацией итерации по ценности (формула 2.15), ядро которой приведено в листинге 3.2. Множество допустимых действий маскируется по компоненте k: при достижении предельной длины черновика k = γ_max все действия continue исключаются, и состояние становится терминальным по оси длины. Итерации продолжаются до выполнения критерия остановки по норме невязки; на табличном MDP из 3600 состояний сходимость достигается за время порядка единиц секунд на одном ядре процессора.</w:t>
+        <w:t xml:space="preserve">«состояние – действие» не меньше порога </w:t>
+      </w:r>
+      <m:oMath>
+        <m:r>
+          <w:rPr>
+            <w:rFonts w:ascii="Cambria Math" w:hAnsi="Cambria Math"/>
+            <w:sz w:val="28"/>
+            <w:szCs w:val="28"/>
+          </w:rPr>
+          <m:t>n</m:t>
+        </m:r>
+        <m:sSub>
+          <m:sSubPr>
+            <m:ctrlPr>
+              <w:rPr>
+                <w:rFonts w:ascii="Cambria Math" w:hAnsi="Cambria Math"/>
+                <w:i/>
+                <w:sz w:val="28"/>
+                <w:szCs w:val="28"/>
+              </w:rPr>
+            </m:ctrlPr>
+          </m:sSubPr>
+          <m:e>
+            <m:r>
+              <w:rPr>
+                <w:rFonts w:ascii="Cambria Math" w:hAnsi="Cambria Math"/>
+                <w:sz w:val="28"/>
+                <w:szCs w:val="28"/>
+              </w:rPr>
+              <m:t>u</m:t>
+            </m:r>
+          </m:e>
+          <m:sub>
+            <m:r>
+              <w:rPr>
+                <w:rFonts w:ascii="Cambria Math" w:hAnsi="Cambria Math"/>
+                <w:sz w:val="28"/>
+                <w:szCs w:val="28"/>
+              </w:rPr>
+              <m:t>min</m:t>
+            </m:r>
+          </m:sub>
+        </m:sSub>
+      </m:oMath>
+      <w:r>
+        <w:rPr>
+          <w:sz w:val="28"/>
+          <w:szCs w:val="28"/>
+        </w:rPr>
+        <w:t xml:space="preserve">спользуется прямая эмпирическая оценка распределения переходов; при меньшем числе наблюдений к оценке добавляется аддитивное сглаживание Лапласа с коэффициентом </w:t>
+      </w:r>
+      <m:oMath>
+        <m:r>
+          <w:rPr>
+            <w:rFonts w:ascii="Cambria Math" w:hAnsi="Cambria Math"/>
+            <w:sz w:val="28"/>
+            <w:szCs w:val="28"/>
+          </w:rPr>
+          <m:t>alph</m:t>
+        </m:r>
+        <m:sSub>
+          <m:sSubPr>
+            <m:ctrlPr>
+              <w:rPr>
+                <w:rFonts w:ascii="Cambria Math" w:hAnsi="Cambria Math"/>
+                <w:i/>
+                <w:sz w:val="28"/>
+                <w:szCs w:val="28"/>
+              </w:rPr>
+            </m:ctrlPr>
+          </m:sSubPr>
+          <m:e>
+            <m:r>
+              <w:rPr>
+                <w:rFonts w:ascii="Cambria Math" w:hAnsi="Cambria Math"/>
+                <w:sz w:val="28"/>
+                <w:szCs w:val="28"/>
+              </w:rPr>
+              <m:t>a</m:t>
+            </m:r>
+          </m:e>
+          <m:sub>
+            <m:r>
+              <w:rPr>
+                <w:rFonts w:ascii="Cambria Math" w:hAnsi="Cambria Math"/>
+                <w:sz w:val="28"/>
+                <w:szCs w:val="28"/>
+              </w:rPr>
+              <m:t>smooth</m:t>
+            </m:r>
+          </m:sub>
+        </m:sSub>
+      </m:oMath>
+      <w:r>
+        <w:rPr>
+          <w:sz w:val="28"/>
+          <w:szCs w:val="28"/>
+        </w:rPr>
+        <w:t xml:space="preserve"> по формуле (2.14). Разреженное представление оправдано структурой задачи: из любого состояния достижимо лишь небольшое число соседних, поэтому матрица переходов содержит порядка одного процента ненулевых элементов.</w:t>
+      </w:r>
+    </w:p>
+    <w:p>
+      <w:pPr>
+        <w:ind w:firstLine="709"/>
+        <w:rPr>
+          <w:sz w:val="28"/>
+          <w:szCs w:val="28"/>
+        </w:rPr>
+      </w:pPr>
+      <w:r>
+        <w:rPr>
+          <w:sz w:val="28"/>
+          <w:szCs w:val="28"/>
+        </w:rPr>
+        <w:t xml:space="preserve">Модуль jointadaspec/mdp/value_iteration.py решает MDP разреженной реализацией итерации по ценности (формула 2.15), ядро которой приведено в листинге 3.2. Множество допустимых действий маскируется по компоненте k: при достижении предельной длины черновика </w:t>
+      </w:r>
+      <m:oMath>
+        <m:r>
+          <w:rPr>
+            <w:rFonts w:ascii="Cambria Math" w:hAnsi="Cambria Math"/>
+            <w:sz w:val="28"/>
+            <w:szCs w:val="28"/>
+          </w:rPr>
+          <m:t xml:space="preserve">k = </m:t>
+        </m:r>
+        <m:sSub>
+          <m:sSubPr>
+            <m:ctrlPr>
+              <w:rPr>
+                <w:rFonts w:ascii="Cambria Math" w:hAnsi="Cambria Math"/>
+                <w:i/>
+                <w:sz w:val="28"/>
+                <w:szCs w:val="28"/>
+              </w:rPr>
+            </m:ctrlPr>
+          </m:sSubPr>
+          <m:e>
+            <m:r>
+              <w:rPr>
+                <w:rFonts w:ascii="Cambria Math" w:hAnsi="Cambria Math"/>
+                <w:sz w:val="28"/>
+                <w:szCs w:val="28"/>
+              </w:rPr>
+              <m:t>γ</m:t>
+            </m:r>
+          </m:e>
+          <m:sub>
+            <m:r>
+              <w:rPr>
+                <w:rFonts w:ascii="Cambria Math" w:hAnsi="Cambria Math"/>
+                <w:sz w:val="28"/>
+                <w:szCs w:val="28"/>
+              </w:rPr>
+              <m:t>max</m:t>
+            </m:r>
+          </m:sub>
+        </m:sSub>
+      </m:oMath>
+      <w:r>
+        <w:rPr>
+          <w:sz w:val="28"/>
+          <w:szCs w:val="28"/>
+        </w:rPr>
+        <w:t>е действия continue исключаются, и состояние становится терминальным по оси длины. Итерации продолжаются до выполнения критерия остановки по норме невязки; на табличном MDP из 3600 состояний сходимость достигается за время порядка единиц секунд на одном ядре процессора.</w:t>
       </w:r>
     </w:p>
     <w:p>
@@ -18900,24 +19716,6 @@
           <w:lang w:val="en-US"/>
         </w:rPr>
         <w:t>def solve_mdp(transitions, rewards, config, action_mask=None):</w:t>
-        <w:br/>
-        <w:t xml:space="preserve">    S, A = rewards.shape</w:t>
-        <w:br/>
-        <w:t xml:space="preserve">    V = np.zeros(S)</w:t>
-        <w:br/>
-        <w:t xml:space="preserve">    invalid = ~action_mask if action_mask is not None else None</w:t>
-        <w:br/>
-        <w:t xml:space="preserve">    for _ in range(config.max_vi_iterations):</w:t>
-        <w:br/>
-        <w:t xml:space="preserve">        expected = transitions.dot(V).reshape(S, A)   # </w:t>
-      </w:r>
-      <w:r>
-        <w:rPr>
-          <w:rFonts w:ascii="Courier New" w:hAnsi="Courier New" w:cs="Courier New"/>
-          <w:sz w:val="22"/>
-          <w:szCs w:val="22"/>
-        </w:rPr>
-        <w:t>разреженно</w:t>
       </w:r>
       <w:r>
         <w:rPr>
@@ -18927,21 +19725,143 @@
           <w:lang w:val="en-US"/>
         </w:rPr>
         <w:br/>
+        <w:t xml:space="preserve">    S, A = rewards.shape</w:t>
+      </w:r>
+      <w:r>
+        <w:rPr>
+          <w:rFonts w:ascii="Courier New" w:hAnsi="Courier New" w:cs="Courier New"/>
+          <w:sz w:val="22"/>
+          <w:szCs w:val="22"/>
+          <w:lang w:val="en-US"/>
+        </w:rPr>
+        <w:br/>
+        <w:t xml:space="preserve">    V = np.zeros(S)</w:t>
+      </w:r>
+      <w:r>
+        <w:rPr>
+          <w:rFonts w:ascii="Courier New" w:hAnsi="Courier New" w:cs="Courier New"/>
+          <w:sz w:val="22"/>
+          <w:szCs w:val="22"/>
+          <w:lang w:val="en-US"/>
+        </w:rPr>
+        <w:br/>
+        <w:t xml:space="preserve">    invalid = ~action_mask if action_mask is not None else None</w:t>
+      </w:r>
+      <w:r>
+        <w:rPr>
+          <w:rFonts w:ascii="Courier New" w:hAnsi="Courier New" w:cs="Courier New"/>
+          <w:sz w:val="22"/>
+          <w:szCs w:val="22"/>
+          <w:lang w:val="en-US"/>
+        </w:rPr>
+        <w:br/>
+        <w:t xml:space="preserve">    for _ in range(config.max_vi_iterations):</w:t>
+      </w:r>
+      <w:r>
+        <w:rPr>
+          <w:rFonts w:ascii="Courier New" w:hAnsi="Courier New" w:cs="Courier New"/>
+          <w:sz w:val="22"/>
+          <w:szCs w:val="22"/>
+          <w:lang w:val="en-US"/>
+        </w:rPr>
+        <w:br/>
+        <w:t xml:space="preserve">        expected = transitions.dot(V).reshape(S, A)   # </w:t>
+      </w:r>
+      <w:r>
+        <w:rPr>
+          <w:rFonts w:ascii="Courier New" w:hAnsi="Courier New" w:cs="Courier New"/>
+          <w:sz w:val="22"/>
+          <w:szCs w:val="22"/>
+        </w:rPr>
+        <w:t>разреженно</w:t>
+      </w:r>
+      <w:r>
+        <w:rPr>
+          <w:rFonts w:ascii="Courier New" w:hAnsi="Courier New" w:cs="Courier New"/>
+          <w:sz w:val="22"/>
+          <w:szCs w:val="22"/>
+          <w:lang w:val="en-US"/>
+        </w:rPr>
+        <w:br/>
         <w:t xml:space="preserve">        Q = rewards + config.lambda_discount * expected</w:t>
+      </w:r>
+      <w:r>
+        <w:rPr>
+          <w:rFonts w:ascii="Courier New" w:hAnsi="Courier New" w:cs="Courier New"/>
+          <w:sz w:val="22"/>
+          <w:szCs w:val="22"/>
+          <w:lang w:val="en-US"/>
+        </w:rPr>
         <w:br/>
         <w:t xml:space="preserve">        if invalid is not None:</w:t>
+      </w:r>
+      <w:r>
+        <w:rPr>
+          <w:rFonts w:ascii="Courier New" w:hAnsi="Courier New" w:cs="Courier New"/>
+          <w:sz w:val="22"/>
+          <w:szCs w:val="22"/>
+          <w:lang w:val="en-US"/>
+        </w:rPr>
         <w:br/>
         <w:t xml:space="preserve">            Q[invalid] = -np.inf</w:t>
+      </w:r>
+      <w:r>
+        <w:rPr>
+          <w:rFonts w:ascii="Courier New" w:hAnsi="Courier New" w:cs="Courier New"/>
+          <w:sz w:val="22"/>
+          <w:szCs w:val="22"/>
+          <w:lang w:val="en-US"/>
+        </w:rPr>
         <w:br/>
         <w:t xml:space="preserve">        new_V = np.max(Q, axis=1)</w:t>
+      </w:r>
+      <w:r>
+        <w:rPr>
+          <w:rFonts w:ascii="Courier New" w:hAnsi="Courier New" w:cs="Courier New"/>
+          <w:sz w:val="22"/>
+          <w:szCs w:val="22"/>
+          <w:lang w:val="en-US"/>
+        </w:rPr>
         <w:br/>
         <w:t xml:space="preserve">        if np.max(np.abs(new_V - V)) &lt; config.epsilon_convergence:</w:t>
+      </w:r>
+      <w:r>
+        <w:rPr>
+          <w:rFonts w:ascii="Courier New" w:hAnsi="Courier New" w:cs="Courier New"/>
+          <w:sz w:val="22"/>
+          <w:szCs w:val="22"/>
+          <w:lang w:val="en-US"/>
+        </w:rPr>
         <w:br/>
         <w:t xml:space="preserve">            V = new_V; break</w:t>
+      </w:r>
+      <w:r>
+        <w:rPr>
+          <w:rFonts w:ascii="Courier New" w:hAnsi="Courier New" w:cs="Courier New"/>
+          <w:sz w:val="22"/>
+          <w:szCs w:val="22"/>
+          <w:lang w:val="en-US"/>
+        </w:rPr>
         <w:br/>
         <w:t xml:space="preserve">        V = new_V</w:t>
+      </w:r>
+      <w:r>
+        <w:rPr>
+          <w:rFonts w:ascii="Courier New" w:hAnsi="Courier New" w:cs="Courier New"/>
+          <w:sz w:val="22"/>
+          <w:szCs w:val="22"/>
+          <w:lang w:val="en-US"/>
+        </w:rPr>
         <w:br/>
         <w:t xml:space="preserve">    pi_star = np.argmax(Q, axis=1)</w:t>
+      </w:r>
+      <w:r>
+        <w:rPr>
+          <w:rFonts w:ascii="Courier New" w:hAnsi="Courier New" w:cs="Courier New"/>
+          <w:sz w:val="22"/>
+          <w:szCs w:val="22"/>
+          <w:lang w:val="en-US"/>
+        </w:rPr>
         <w:br/>
         <w:t xml:space="preserve">    return V, pi_star</w:t>
       </w:r>
@@ -18970,6 +19890,12 @@
           <w:szCs w:val="28"/>
         </w:rPr>
         <w:t xml:space="preserve">Стадия 02_solve_mdp.py решает MDP не для одного, а для набора значений множителя κ из конфигурации (поле kappa_values). Для каждого κ базовая конфигурация копируется с заменой поля kappa, после чего общим решателем находятся совместная и обе каскадные политики, сохраняемые с </w:t>
+      </w:r>
+      <w:r>
+        <w:rPr>
+          <w:sz w:val="28"/>
+          <w:szCs w:val="28"/>
+        </w:rPr>
         <w:lastRenderedPageBreak/>
         <w:t>суффиксом значения κ. Перебор κ строит, согласно теореме 2.4, набор точек на границе Парето «скорость – качество» – и всё это без повторного сбора трейсов, благодаря независимости стадий конвейера.</w:t>
       </w:r>
@@ -19061,6 +19987,12 @@
           <w:szCs w:val="28"/>
         </w:rPr>
         <w:t xml:space="preserve">Само правило приёма реализовано в модуле core/verification.py. Точная верификация (функция modified_rejection_sampling) принимает черновой токен с вероятностью min(1, p / q) и при отклонении пересемплирует токен из остаточного распределения, воспроизводя формулу (1.2); нечёткий вариант ослабляет условие сравнения множителем T согласно (1.4). Декодер </w:t>
+      </w:r>
+      <w:r>
+        <w:rPr>
+          <w:sz w:val="28"/>
+          <w:szCs w:val="28"/>
+        </w:rPr>
         <w:lastRenderedPageBreak/>
         <w:t>JointAdaSpecDecoder вызывает это правило с порогом, который вернула политика, и накапливает принятый префикс блока, после чего обновляет состояние и переходит к следующему блоку.</w:t>
       </w:r>
@@ -19545,9 +20477,88 @@
           <w:sz w:val="28"/>
           <w:szCs w:val="28"/>
         </w:rPr>
-        <w:t xml:space="preserve">Стадия 03_benchmark.py выполняет сравнение в многосидовом режиме и устойчива к сбоям: результаты дописываются в results.jsonl построчно, а уже посчитанные комбинации (метод, сид, промпт) пропускаются при повторном </w:t>
+        <w:t xml:space="preserve">Стадия 03_benchmark.py выполняет сравнение в многосидовом режиме и устойчива к сбоям: результаты дописываются в </w:t>
+      </w:r>
+      <w:proofErr w:type="gramStart"/>
+      <w:r>
+        <w:rPr>
+          <w:sz w:val="28"/>
+          <w:szCs w:val="28"/>
+        </w:rPr>
+        <w:t>results.jsonl</w:t>
+      </w:r>
+      <w:proofErr w:type="gramEnd"/>
+      <w:r>
+        <w:rPr>
+          <w:sz w:val="28"/>
+          <w:szCs w:val="28"/>
+        </w:rPr>
+        <w:t xml:space="preserve"> построчно, а уже посчитанные комбинации (метод, сид, промпт) пропускаются при повторном </w:t>
+      </w:r>
+      <w:r>
+        <w:rPr>
+          <w:sz w:val="28"/>
+          <w:szCs w:val="28"/>
+        </w:rPr>
         <w:lastRenderedPageBreak/>
-        <w:t>запуске по ключу resume_key. Наряду с основным файлом ведётся совместимый со старыми читателями журнал run.jsonl. Такая организация позволяет докатывать длительный прогон после прерывания, не теряя ранее вычисленных записей.</w:t>
+        <w:t xml:space="preserve">запуске по ключу </w:t>
+      </w:r>
+      <m:oMath>
+        <m:r>
+          <w:rPr>
+            <w:rFonts w:ascii="Cambria Math" w:hAnsi="Cambria Math"/>
+            <w:sz w:val="28"/>
+            <w:szCs w:val="28"/>
+          </w:rPr>
+          <m:t>resum</m:t>
+        </m:r>
+        <m:sSub>
+          <m:sSubPr>
+            <m:ctrlPr>
+              <w:rPr>
+                <w:rFonts w:ascii="Cambria Math" w:hAnsi="Cambria Math"/>
+                <w:i/>
+                <w:sz w:val="28"/>
+                <w:szCs w:val="28"/>
+              </w:rPr>
+            </m:ctrlPr>
+          </m:sSubPr>
+          <m:e>
+            <m:r>
+              <w:rPr>
+                <w:rFonts w:ascii="Cambria Math" w:hAnsi="Cambria Math"/>
+                <w:sz w:val="28"/>
+                <w:szCs w:val="28"/>
+              </w:rPr>
+              <m:t>e</m:t>
+            </m:r>
+          </m:e>
+          <m:sub>
+            <m:r>
+              <w:rPr>
+                <w:rFonts w:ascii="Cambria Math" w:hAnsi="Cambria Math"/>
+                <w:sz w:val="28"/>
+                <w:szCs w:val="28"/>
+              </w:rPr>
+              <m:t>key</m:t>
+            </m:r>
+          </m:sub>
+        </m:sSub>
+        <m:r>
+          <w:rPr>
+            <w:rFonts w:ascii="Cambria Math" w:hAnsi="Cambria Math"/>
+            <w:sz w:val="28"/>
+            <w:szCs w:val="28"/>
+          </w:rPr>
+          <m:t>.</m:t>
+        </m:r>
+      </m:oMath>
+      <w:r>
+        <w:rPr>
+          <w:sz w:val="28"/>
+          <w:szCs w:val="28"/>
+        </w:rPr>
+        <w:t xml:space="preserve"> Наряду с основным файлом ведётся совместимый со старыми читателями журнал run.jsonl. Такая организация позволяет докатывать длительный прогон после прерывания, не теряя ранее вычисленных записей.</w:t>
       </w:r>
     </w:p>
     <w:p>
@@ -19686,6 +20697,12 @@
           <w:szCs w:val="28"/>
         </w:rPr>
         <w:t xml:space="preserve">форму извлечённой политики; тесты признаков – корректность энтропии, дивергенции и обратимость дискретизации; тесты верификации – сохранение распределения точным правилом и долю принятий при нечётком; тесты каскада – совпадение совместной и каскадной политик на сепарабельной награде (вырожденный случай теоремы 2.3); сквозной тест прогоняет весь конвейер на игрушечных </w:t>
+      </w:r>
+      <w:r>
+        <w:rPr>
+          <w:sz w:val="28"/>
+          <w:szCs w:val="28"/>
+        </w:rPr>
         <w:lastRenderedPageBreak/>
         <w:t>моделях. Тем самым проверяется математическая корректность ядра, а не только отсутствие ошибок компиляции.</w:t>
       </w:r>
@@ -19859,6 +20876,12 @@
           <w:szCs w:val="28"/>
         </w:rPr>
         <w:t xml:space="preserve">Статистическая надёжность обеспечена многосидовой схемой. Каждая конфигурация прогоняется на трёх начальных значениях из детерминированной последовательности [42, 43, 44], что при выборке в 100–500 промптов даёт от 300 до 1500 парных наблюдений. Разность качества оценивается на парных данных: для каждого промпта сравниваются ответы двух методов, значимость проверяется парным критерием Макнемара, а доверительные интервалы вычисляются бутстрепом. Трейсы для оценки MDP </w:t>
+      </w:r>
+      <w:r>
+        <w:rPr>
+          <w:sz w:val="28"/>
+          <w:szCs w:val="28"/>
+        </w:rPr>
         <w:lastRenderedPageBreak/>
         <w:t>собираются на обучающей части GSM8K, а бенчмарк выполняется на тестовой – обе выборки законно отложены.</w:t>
       </w:r>
@@ -20214,6 +21237,12 @@
           <w:szCs w:val="28"/>
         </w:rPr>
         <w:t xml:space="preserve">Обе пары выбраны из соображений совместимости токенизаторов: черновая и целевая модели внутри пары используют идентичную таблицу словаря, что является обязательным условием корректности спекулятивной </w:t>
+      </w:r>
+      <w:r>
+        <w:rPr>
+          <w:sz w:val="28"/>
+          <w:szCs w:val="28"/>
+        </w:rPr>
         <w:lastRenderedPageBreak/>
         <w:t>верификации (подраздел 1.2). Веса всех моделей размещены локально, что исключает зависимость прогона от внешних репозиториев.</w:t>
       </w:r>
@@ -20808,6 +21837,12 @@
           <w:szCs w:val="28"/>
         </w:rPr>
         <w:t xml:space="preserve">Парный характер критерия Макнемара здесь существен. Значимость определяют не валовые доли правильных ответов, а дискордантные пары – </w:t>
+      </w:r>
+      <w:r>
+        <w:rPr>
+          <w:sz w:val="28"/>
+          <w:szCs w:val="28"/>
+        </w:rPr>
         <w:lastRenderedPageBreak/>
         <w:t>промпты, на которых два метода расходятся: совместная политика чаще исправляет ошибку прямой генерации, чем портит верный ответ, и именно этот перевес исправлений над порчей даёт прирост. Доверительный интервал [+0,73; +7,40], не пересекающий нуля, подтверждает значимость на уровне p &lt; 0,05.</w:t>
       </w:r>
@@ -22568,6 +23603,12 @@
           <w:szCs w:val="28"/>
         </w:rPr>
         <w:t xml:space="preserve">Совместная политика доминирует каждый фиксированный порог сразу по обеим осям: она точнее на +4…+8 п.п. exact match и при этом быстрее примерно в 3,7 раза (11,12 против ≈3,0 ток/с). Это и есть содержание теоремы E: адаптивное управление эмпирически нетривиально по сравнению с естественным неадаптивным базисом. Тем самым то единственное, чему </w:t>
+      </w:r>
+      <w:r>
+        <w:rPr>
+          <w:sz w:val="28"/>
+          <w:szCs w:val="28"/>
+        </w:rPr>
         <w:lastRenderedPageBreak/>
         <w:t>совместная политика лишь не уступает, – это другая адаптивная MDP-политика (каскад), что в точности предсказано теоремой D.</w:t>
       </w:r>
@@ -22714,6 +23755,12 @@
           <w:szCs w:val="28"/>
         </w:rPr>
         <w:t xml:space="preserve">Пропускная способность вдоль κ почти постоянна (16,28–16,55 ток/с), а точность меняется немонотонно (совместная 55,7–60,3 %, каскадная 55,0–61,0 %); при этом совместная и каскадная политики близки при каждом κ (расхождение не более трёх пунктов). Эквивалентность joint ≈ cascade устойчива ко всему диапазону трейд-офф-параметра, а не только к его значению по умолчанию. Следует честно оговорить: строгая выпуклость </w:t>
+      </w:r>
+      <w:r>
+        <w:rPr>
+          <w:sz w:val="28"/>
+          <w:szCs w:val="28"/>
+        </w:rPr>
         <w:lastRenderedPageBreak/>
         <w:t>достижимого множества (теорема 2.4) при объёме n = 300 на значение κ чисто не демонстрируется – этот результат носит характер согласованности, а не строгого подтверждения.</w:t>
       </w:r>
@@ -23226,6 +24273,12 @@
           <w:szCs w:val="28"/>
         </w:rPr>
         <w:t xml:space="preserve">Отдельного внимания заслуживает устойчивость к смещению распределения. Политика обучается при длине черновика k = 8; её перенос на k = 16 без переобучения ожидаемо приводит к регрессии, поскольку расширенное пространство состояний не покрыто трейсами – это </w:t>
+      </w:r>
+      <w:r>
+        <w:rPr>
+          <w:sz w:val="28"/>
+          <w:szCs w:val="28"/>
+        </w:rPr>
         <w:lastRenderedPageBreak/>
         <w:t>методологически ожидаемое ограничение области определения, а не дефект метода. На объединённой отложенной выборке пары 7B/1.5B (n = 3000) совместная политика теряет −2,00 п.п. (p = 0,067), причём каскадная теряет больше; такое поведение характеризуется как грациозная деградация при сдвиге распределения. Эти ограничения очерчивают область надёжного применения метода.</w:t>
       </w:r>
@@ -23342,6 +24395,12 @@
           <w:szCs w:val="28"/>
         </w:rPr>
         <w:t xml:space="preserve">Центральный теоретический и эмпирический результат – точная характеризация соотношения совместной и каскадной политик: они статистически неразличимы (−0,13 п.п., p = 0,96), и это не случайность, а следствие доказанной теоремы D, выражающей разрыв ценности через преимущество каскада на множестве нарушения условия супермодулярности, которое эмпирически пренебрежимо мало. Получен сопутствующий теоретический аппарат: выборочная сложность оценщика переходов (теорема A), Беллман-инвариантность аддитивного штрафа качества (B), оценка субоптимальности каскада (C), слабое доминирование (2.3) и скаляризация </w:t>
+      </w:r>
+      <w:r>
+        <w:rPr>
+          <w:sz w:val="28"/>
+          <w:szCs w:val="28"/>
+        </w:rPr>
         <w:lastRenderedPageBreak/>
         <w:t>Парето-фронта (2.4). Эмпирически адаптивное управление значимо превосходит любой неадаптивный базис – прямую генерацию, ванильное спекулятивное декодирование и фиксированный нечёткий порог: совместная политика точнее каждого фиксированного порога на +4…+8 п.п. и быстрее примерно в 3,7 раза (теорема E). Научная новизна состоит в первой формализации совместного управления двумя осями как единого MDP с доказуемыми свойствами.</w:t>
       </w:r>
@@ -24684,6 +25743,14 @@
         </w:rPr>
         <w:lastRenderedPageBreak/>
         <w:t>ПРИЛОЖЕНИЕ А</w:t>
+      </w:r>
+      <w:r>
+        <w:rPr>
+          <w:b/>
+          <w:bCs/>
+          <w:sz w:val="28"/>
+          <w:szCs w:val="28"/>
+        </w:rPr>
         <w:br/>
         <w:t>ДОКАЗАТЕЛЬСТВА ТЕОРЕМ</w:t>
       </w:r>
@@ -24782,7 +25849,78 @@
           <w:sz w:val="28"/>
           <w:szCs w:val="28"/>
         </w:rPr>
-        <w:t>Доказательство ведётся индукцией по длине черновика γ. База (γ = 1): один черновой токен принимается с вероятностью min(1, p/q), а при отклонении пересемплируется из нормированного остатка (p − q)_+; прямая проверка показывает, что итоговое распределение токена равно p. Шаг индукции: пусть утверждение верно для длины γ − 1. Для первого токена результат правила (1.2) распределён по p; при его принятии контекст обновляется, и к оставшимся γ − 1 кандидатам применяется предположение индукции, дающее условное распределение целевой модели; при отклонении итерация завершается одним токеном из остатка. Совместное распределение записывается суммой по числу N подряд принятых токенов,</w:t>
+        <w:t xml:space="preserve">Доказательство ведётся индукцией по длине черновика γ. База (γ = 1): один черновой токен принимается с вероятностью min(1, p/q), а при отклонении пересемплируется из нормированного остатка </w:t>
+      </w:r>
+      <m:oMath>
+        <m:sSub>
+          <m:sSubPr>
+            <m:ctrlPr>
+              <w:rPr>
+                <w:rFonts w:ascii="Cambria Math" w:hAnsi="Cambria Math"/>
+                <w:i/>
+                <w:sz w:val="28"/>
+                <w:szCs w:val="28"/>
+              </w:rPr>
+            </m:ctrlPr>
+          </m:sSubPr>
+          <m:e>
+            <m:d>
+              <m:dPr>
+                <m:ctrlPr>
+                  <w:rPr>
+                    <w:rFonts w:ascii="Cambria Math" w:hAnsi="Cambria Math"/>
+                    <w:i/>
+                    <w:sz w:val="28"/>
+                    <w:szCs w:val="28"/>
+                  </w:rPr>
+                </m:ctrlPr>
+              </m:dPr>
+              <m:e>
+                <m:r>
+                  <w:rPr>
+                    <w:rFonts w:ascii="Cambria Math" w:hAnsi="Cambria Math"/>
+                    <w:sz w:val="28"/>
+                    <w:szCs w:val="28"/>
+                  </w:rPr>
+                  <m:t xml:space="preserve">p </m:t>
+                </m:r>
+                <m:r>
+                  <w:rPr>
+                    <w:rFonts w:ascii="Cambria Math" w:hAnsi="Cambria Math"/>
+                    <w:sz w:val="28"/>
+                    <w:szCs w:val="28"/>
+                  </w:rPr>
+                  <m:t>–</m:t>
+                </m:r>
+                <m:r>
+                  <w:rPr>
+                    <w:rFonts w:ascii="Cambria Math" w:hAnsi="Cambria Math"/>
+                    <w:sz w:val="28"/>
+                    <w:szCs w:val="28"/>
+                  </w:rPr>
+                  <m:t xml:space="preserve"> q</m:t>
+                </m:r>
+              </m:e>
+            </m:d>
+          </m:e>
+          <m:sub>
+            <m:r>
+              <w:rPr>
+                <w:rFonts w:ascii="Cambria Math" w:hAnsi="Cambria Math"/>
+                <w:sz w:val="28"/>
+                <w:szCs w:val="28"/>
+              </w:rPr>
+              <m:t>+</m:t>
+            </m:r>
+          </m:sub>
+        </m:sSub>
+      </m:oMath>
+      <w:r>
+        <w:rPr>
+          <w:sz w:val="28"/>
+          <w:szCs w:val="28"/>
+        </w:rPr>
+        <w:t>; прямая проверка показывает, что итоговое распределение токена равно p. Шаг индукции: пусть утверждение верно для длины γ − 1. Для первого токена результат правила (1.2) распределён по p; при его принятии контекст обновляется, и к оставшимся γ − 1 кандидатам применяется предположение индукции, дающее условное распределение целевой модели; при отклонении итерация завершается одним токеном из остатка. Совместное распределение записывается суммой по числу N подряд принятых токенов,</w:t>
       </w:r>
     </w:p>
     <w:p>
@@ -25267,7 +26405,57 @@
           <w:sz w:val="28"/>
           <w:szCs w:val="28"/>
         </w:rPr>
-        <w:t>Часть смещения: сглаживание Лапласа с параметром α при n наблюдениях отклоняет оценку от несглаженной не более чем на α / (n + α) покоординатно; суммирование по носителю и по парам (s, a) и распространение через сжатие дают аддитивный член α |S| R / ((1 − λ)(n_min + α)). Сложение двух частей и даёт правую часть (2.10) с вероятностью не менее 1 − δ. Бэунд не туг по абсолютной величине, но устанавливает скорость сходимости порядка 1 / √(</w:t>
+        <w:t xml:space="preserve">Часть смещения: сглаживание Лапласа с параметром α при n наблюдениях отклоняет оценку от несглаженной не более чем на α / (n + α) покоординатно; суммирование по носителю и по парам (s, a) и распространение через сжатие дают аддитивный член α |S| R / ((1 − </w:t>
+      </w:r>
+      <w:proofErr w:type="gramStart"/>
+      <w:r>
+        <w:rPr>
+          <w:sz w:val="28"/>
+          <w:szCs w:val="28"/>
+        </w:rPr>
+        <w:t>λ)(</w:t>
+      </w:r>
+      <w:proofErr w:type="gramEnd"/>
+      <m:oMath>
+        <m:sSub>
+          <m:sSubPr>
+            <m:ctrlPr>
+              <w:rPr>
+                <w:rFonts w:ascii="Cambria Math" w:hAnsi="Cambria Math"/>
+                <w:i/>
+                <w:sz w:val="28"/>
+                <w:szCs w:val="28"/>
+              </w:rPr>
+            </m:ctrlPr>
+          </m:sSubPr>
+          <m:e>
+            <m:r>
+              <w:rPr>
+                <w:rFonts w:ascii="Cambria Math" w:hAnsi="Cambria Math"/>
+                <w:sz w:val="28"/>
+                <w:szCs w:val="28"/>
+              </w:rPr>
+              <m:t>n</m:t>
+            </m:r>
+          </m:e>
+          <m:sub>
+            <m:r>
+              <w:rPr>
+                <w:rFonts w:ascii="Cambria Math" w:hAnsi="Cambria Math"/>
+                <w:sz w:val="28"/>
+                <w:szCs w:val="28"/>
+              </w:rPr>
+              <m:t>min</m:t>
+            </m:r>
+          </m:sub>
+        </m:sSub>
+      </m:oMath>
+      <w:r>
+        <w:rPr>
+          <w:sz w:val="28"/>
+          <w:szCs w:val="28"/>
+        </w:rPr>
+        <w:t>α)). Сложение двух частей и даёт правую часть (2.10) с вероятностью не менее 1 − δ. Бэунд не туг по абсолютной величине, но устанавливает скорость сходимости порядка 1 / √(</w:t>
       </w:r>
       <m:oMath>
         <m:sSub>
@@ -25898,6 +27086,12 @@
           <w:szCs w:val="28"/>
         </w:rPr>
         <w:t xml:space="preserve">Слагаемое −g(s) не зависит от действия и выносится за знак максимума, поэтому argmax по a – а с ним и оптимальная политика – совпадает с политикой исходного MDP; функция ценности отличается лишь на дисконтированную сумму штрафов вдоль траектории. Следовательно, штраф качества способна </w:t>
+      </w:r>
+      <w:r>
+        <w:rPr>
+          <w:sz w:val="28"/>
+          <w:szCs w:val="28"/>
+        </w:rPr>
         <w:lastRenderedPageBreak/>
         <w:t>изменить только связанная с действием форма, что и обосновывает конструкцию награды (2.8). Аддитивность сохраняет λ-сжатие оператора, тогда как мультипликативная форма его разрушала.</w:t>
       </w:r>
@@ -26427,7 +27621,56 @@
           <w:sz w:val="28"/>
           <w:szCs w:val="28"/>
         </w:rPr>
-        <w:t xml:space="preserve">Вне множества B нарушения условия C4 каскадная политика локально оптимальна, и преимущество неположительно; на B оно по модулю не превосходит 2R_max / (1 − λ). Разбивая ожидание по индикатору B и оценивая часть на B сверху, получаем оценку (2.11), линейную по стационарной массе нарушения </w:t>
+        <w:t xml:space="preserve">Вне множества B нарушения условия C4 каскадная политика локально оптимальна, и преимущество неположительно; на B оно по модулю не превосходит </w:t>
+      </w:r>
+      <m:oMath>
+        <m:r>
+          <w:rPr>
+            <w:rFonts w:ascii="Cambria Math" w:hAnsi="Cambria Math"/>
+            <w:sz w:val="28"/>
+            <w:szCs w:val="28"/>
+          </w:rPr>
+          <m:t>2</m:t>
+        </m:r>
+        <m:sSub>
+          <m:sSubPr>
+            <m:ctrlPr>
+              <w:rPr>
+                <w:rFonts w:ascii="Cambria Math" w:hAnsi="Cambria Math"/>
+                <w:i/>
+                <w:sz w:val="28"/>
+                <w:szCs w:val="28"/>
+              </w:rPr>
+            </m:ctrlPr>
+          </m:sSubPr>
+          <m:e>
+            <m:r>
+              <w:rPr>
+                <w:rFonts w:ascii="Cambria Math" w:hAnsi="Cambria Math"/>
+                <w:sz w:val="28"/>
+                <w:szCs w:val="28"/>
+              </w:rPr>
+              <m:t>R</m:t>
+            </m:r>
+          </m:e>
+          <m:sub>
+            <m:r>
+              <w:rPr>
+                <w:rFonts w:ascii="Cambria Math" w:hAnsi="Cambria Math"/>
+                <w:sz w:val="28"/>
+                <w:szCs w:val="28"/>
+              </w:rPr>
+              <m:t>max</m:t>
+            </m:r>
+          </m:sub>
+        </m:sSub>
+      </m:oMath>
+      <w:r>
+        <w:rPr>
+          <w:sz w:val="28"/>
+          <w:szCs w:val="28"/>
+        </w:rPr>
+        <w:t xml:space="preserve">(1 − λ). Разбивая ожидание по индикатору B и оценивая часть на B сверху, получаем оценку (2.11), линейную по стационарной массе нарушения </w:t>
       </w:r>
       <m:oMath>
         <m:r>
@@ -27219,6 +28462,14 @@
         </w:rPr>
         <w:lastRenderedPageBreak/>
         <w:t>ПРИЛОЖЕНИЕ Б</w:t>
+      </w:r>
+      <w:r>
+        <w:rPr>
+          <w:b/>
+          <w:bCs/>
+          <w:sz w:val="28"/>
+          <w:szCs w:val="28"/>
+        </w:rPr>
         <w:br/>
         <w:t>АРХИТЕКТУРА РЕПОЗИТОРИЯ И ЛИСТИНГИ</w:t>
       </w:r>
@@ -27290,20 +28541,76 @@
           <w:szCs w:val="22"/>
         </w:rPr>
         <w:t>record = {</w:t>
+      </w:r>
+      <w:r>
+        <w:rPr>
+          <w:rFonts w:ascii="Courier New" w:hAnsi="Courier New" w:cs="Courier New"/>
+          <w:sz w:val="22"/>
+          <w:szCs w:val="22"/>
+        </w:rPr>
         <w:br/>
         <w:t xml:space="preserve">    "state_index": state_idx,    # дискретный индекс s = (i_H, i_K, k)</w:t>
+      </w:r>
+      <w:r>
+        <w:rPr>
+          <w:rFonts w:ascii="Courier New" w:hAnsi="Courier New" w:cs="Courier New"/>
+          <w:sz w:val="22"/>
+          <w:szCs w:val="22"/>
+        </w:rPr>
         <w:br/>
         <w:t xml:space="preserve">    "action_index": action_idx,  # индекс действия (a_length, T)</w:t>
+      </w:r>
+      <w:r>
+        <w:rPr>
+          <w:rFonts w:ascii="Courier New" w:hAnsi="Courier New" w:cs="Courier New"/>
+          <w:sz w:val="22"/>
+          <w:szCs w:val="22"/>
+        </w:rPr>
         <w:br/>
         <w:t xml:space="preserve">    "k": k,                       # позиция в черновике</w:t>
+      </w:r>
+      <w:r>
+        <w:rPr>
+          <w:rFonts w:ascii="Courier New" w:hAnsi="Courier New" w:cs="Courier New"/>
+          <w:sz w:val="22"/>
+          <w:szCs w:val="22"/>
+        </w:rPr>
         <w:br/>
         <w:t xml:space="preserve">    "accepted": int(accepted),    # принят ли токен</w:t>
+      </w:r>
+      <w:r>
+        <w:rPr>
+          <w:rFonts w:ascii="Courier New" w:hAnsi="Courier New" w:cs="Courier New"/>
+          <w:sz w:val="22"/>
+          <w:szCs w:val="22"/>
+        </w:rPr>
         <w:br/>
         <w:t xml:space="preserve">    "proposed": int(proposed),    # предложен ли токен черновиком</w:t>
+      </w:r>
+      <w:r>
+        <w:rPr>
+          <w:rFonts w:ascii="Courier New" w:hAnsi="Courier New" w:cs="Courier New"/>
+          <w:sz w:val="22"/>
+          <w:szCs w:val="22"/>
+        </w:rPr>
         <w:br/>
         <w:t xml:space="preserve">    "reward": reward,             # мгновенная награда r(s, a)</w:t>
+      </w:r>
+      <w:r>
+        <w:rPr>
+          <w:rFonts w:ascii="Courier New" w:hAnsi="Courier New" w:cs="Courier New"/>
+          <w:sz w:val="22"/>
+          <w:szCs w:val="22"/>
+        </w:rPr>
         <w:br/>
         <w:t xml:space="preserve">    "next_state_index": next_idx, # следующее состояние s'</w:t>
+      </w:r>
+      <w:r>
+        <w:rPr>
+          <w:rFonts w:ascii="Courier New" w:hAnsi="Courier New" w:cs="Courier New"/>
+          <w:sz w:val="22"/>
+          <w:szCs w:val="22"/>
+        </w:rPr>
         <w:br/>
         <w:t>}</w:t>
       </w:r>
@@ -27389,18 +28696,6 @@
         </w:rPr>
         <w:br/>
         <w:t>action_length, threshold = self.policy.get_action(H=H, K=K, k=k)</w:t>
-        <w:br/>
-        <w:t>if action_length == "stop":</w:t>
-        <w:br/>
-        <w:t xml:space="preserve">    self._verify_block(...)            # </w:t>
-      </w:r>
-      <w:r>
-        <w:rPr>
-          <w:rFonts w:ascii="Courier New" w:hAnsi="Courier New" w:cs="Courier New"/>
-          <w:sz w:val="22"/>
-          <w:szCs w:val="22"/>
-        </w:rPr>
-        <w:t>нечёткая</w:t>
       </w:r>
       <w:r>
         <w:rPr>
@@ -27409,15 +28704,8 @@
           <w:szCs w:val="22"/>
           <w:lang w:val="en-US"/>
         </w:rPr>
-        <w:t xml:space="preserve"> </w:t>
-      </w:r>
-      <w:r>
-        <w:rPr>
-          <w:rFonts w:ascii="Courier New" w:hAnsi="Courier New" w:cs="Courier New"/>
-          <w:sz w:val="22"/>
-          <w:szCs w:val="22"/>
-        </w:rPr>
-        <w:t>верификация</w:t>
+        <w:br/>
+        <w:t>if action_length == "stop":</w:t>
       </w:r>
       <w:r>
         <w:rPr>
@@ -27427,9 +28715,7 @@
           <w:lang w:val="en-US"/>
         </w:rPr>
         <w:br/>
-        <w:t>else:</w:t>
-        <w:br/>
-        <w:t xml:space="preserve">    k = min(k + 1, self.policy.config.gamma_max)   # </w:t>
+        <w:t xml:space="preserve">    self._verify_block(...)            # </w:t>
       </w:r>
       <w:r>
         <w:rPr>
@@ -27437,7 +28723,7 @@
           <w:sz w:val="22"/>
           <w:szCs w:val="22"/>
         </w:rPr>
-        <w:t>продолжить</w:t>
+        <w:t>нечёткая</w:t>
       </w:r>
       <w:r>
         <w:rPr>
@@ -27446,8 +28732,7 @@
           <w:szCs w:val="22"/>
           <w:lang w:val="en-US"/>
         </w:rPr>
-        <w:br/>
-        <w:t xml:space="preserve">self.K_prev = kl_divergence(q_probs, p_probs)  # </w:t>
+        <w:t xml:space="preserve"> </w:t>
       </w:r>
       <w:r>
         <w:rPr>
@@ -27455,7 +28740,7 @@
           <w:sz w:val="22"/>
           <w:szCs w:val="22"/>
         </w:rPr>
-        <w:t>задержка</w:t>
+        <w:t>верификация</w:t>
       </w:r>
       <w:r>
         <w:rPr>
@@ -27464,6 +28749,52 @@
           <w:szCs w:val="22"/>
           <w:lang w:val="en-US"/>
         </w:rPr>
+        <w:br/>
+        <w:t>else:</w:t>
+      </w:r>
+      <w:r>
+        <w:rPr>
+          <w:rFonts w:ascii="Courier New" w:hAnsi="Courier New" w:cs="Courier New"/>
+          <w:sz w:val="22"/>
+          <w:szCs w:val="22"/>
+          <w:lang w:val="en-US"/>
+        </w:rPr>
+        <w:br/>
+        <w:t xml:space="preserve">    k = min(k + 1, self.policy.config.gamma_max)   # </w:t>
+      </w:r>
+      <w:r>
+        <w:rPr>
+          <w:rFonts w:ascii="Courier New" w:hAnsi="Courier New" w:cs="Courier New"/>
+          <w:sz w:val="22"/>
+          <w:szCs w:val="22"/>
+        </w:rPr>
+        <w:t>продолжить</w:t>
+      </w:r>
+      <w:r>
+        <w:rPr>
+          <w:rFonts w:ascii="Courier New" w:hAnsi="Courier New" w:cs="Courier New"/>
+          <w:sz w:val="22"/>
+          <w:szCs w:val="22"/>
+          <w:lang w:val="en-US"/>
+        </w:rPr>
+        <w:br/>
+        <w:t xml:space="preserve">self.K_prev = kl_divergence(q_probs, p_probs)  # </w:t>
+      </w:r>
+      <w:r>
+        <w:rPr>
+          <w:rFonts w:ascii="Courier New" w:hAnsi="Courier New" w:cs="Courier New"/>
+          <w:sz w:val="22"/>
+          <w:szCs w:val="22"/>
+        </w:rPr>
+        <w:t>задержка</w:t>
+      </w:r>
+      <w:r>
+        <w:rPr>
+          <w:rFonts w:ascii="Courier New" w:hAnsi="Courier New" w:cs="Courier New"/>
+          <w:sz w:val="22"/>
+          <w:szCs w:val="22"/>
+          <w:lang w:val="en-US"/>
+        </w:rPr>
         <w:t xml:space="preserve"> K</w:t>
       </w:r>
     </w:p>
@@ -27489,6 +28820,14 @@
         </w:rPr>
         <w:lastRenderedPageBreak/>
         <w:t>ПРИЛОЖЕНИЕ В</w:t>
+      </w:r>
+      <w:r>
+        <w:rPr>
+          <w:b/>
+          <w:bCs/>
+          <w:sz w:val="28"/>
+          <w:szCs w:val="28"/>
+        </w:rPr>
         <w:br/>
         <w:t>ДОПОЛНИТЕЛЬНЫЕ ЭКСПЕРИМЕНТАЛЬНЫЕ ДАННЫЕ</w:t>
       </w:r>
@@ -28151,6 +29490,14 @@
         </w:rPr>
         <w:lastRenderedPageBreak/>
         <w:t xml:space="preserve">ПРИЛОЖЕНИЕ Г </w:t>
+      </w:r>
+      <w:r>
+        <w:rPr>
+          <w:b/>
+          <w:bCs/>
+          <w:sz w:val="28"/>
+          <w:szCs w:val="28"/>
+        </w:rPr>
         <w:br/>
         <w:t>МАНИФЕСТЫ ВОСПРОИЗВОДИМОСТИ</w:t>
       </w:r>
@@ -28227,30 +29574,134 @@
           <w:lang w:val="en-US"/>
         </w:rPr>
         <w:t>{</w:t>
+      </w:r>
+      <w:r>
+        <w:rPr>
+          <w:rFonts w:ascii="Courier New" w:hAnsi="Courier New" w:cs="Courier New"/>
+          <w:sz w:val="22"/>
+          <w:szCs w:val="22"/>
+          <w:lang w:val="en-US"/>
+        </w:rPr>
         <w:br/>
         <w:t xml:space="preserve">  "generated_at": "2026-05-13T19:40:46Z",</w:t>
+      </w:r>
+      <w:r>
+        <w:rPr>
+          <w:rFonts w:ascii="Courier New" w:hAnsi="Courier New" w:cs="Courier New"/>
+          <w:sz w:val="22"/>
+          <w:szCs w:val="22"/>
+          <w:lang w:val="en-US"/>
+        </w:rPr>
         <w:br/>
         <w:t xml:space="preserve">  "git_sha": "e1b32ea7…", "git_branch": "main", "git_dirty": true,</w:t>
+      </w:r>
+      <w:r>
+        <w:rPr>
+          <w:rFonts w:ascii="Courier New" w:hAnsi="Courier New" w:cs="Courier New"/>
+          <w:sz w:val="22"/>
+          <w:szCs w:val="22"/>
+          <w:lang w:val="en-US"/>
+        </w:rPr>
         <w:br/>
         <w:t xml:space="preserve">  "nvidia_smi": "NVIDIA GeForce RTX 5090, 32607 MiB",</w:t>
+      </w:r>
+      <w:r>
+        <w:rPr>
+          <w:rFonts w:ascii="Courier New" w:hAnsi="Courier New" w:cs="Courier New"/>
+          <w:sz w:val="22"/>
+          <w:szCs w:val="22"/>
+          <w:lang w:val="en-US"/>
+        </w:rPr>
         <w:br/>
         <w:t xml:space="preserve">  "python": "3.12.3",</w:t>
+      </w:r>
+      <w:r>
+        <w:rPr>
+          <w:rFonts w:ascii="Courier New" w:hAnsi="Courier New" w:cs="Courier New"/>
+          <w:sz w:val="22"/>
+          <w:szCs w:val="22"/>
+          <w:lang w:val="en-US"/>
+        </w:rPr>
         <w:br/>
         <w:t xml:space="preserve">  "torch_version": "2.9.1+cu128", "transformers_version": "4.57.3",</w:t>
+      </w:r>
+      <w:r>
+        <w:rPr>
+          <w:rFonts w:ascii="Courier New" w:hAnsi="Courier New" w:cs="Courier New"/>
+          <w:sz w:val="22"/>
+          <w:szCs w:val="22"/>
+          <w:lang w:val="en-US"/>
+        </w:rPr>
         <w:br/>
         <w:t xml:space="preserve">  "scipy_version": "1.17.0", "numpy_version": "2.4.2",</w:t>
+      </w:r>
+      <w:r>
+        <w:rPr>
+          <w:rFonts w:ascii="Courier New" w:hAnsi="Courier New" w:cs="Courier New"/>
+          <w:sz w:val="22"/>
+          <w:szCs w:val="22"/>
+          <w:lang w:val="en-US"/>
+        </w:rPr>
         <w:br/>
         <w:t xml:space="preserve">  "seed_list": [42, 43, 44],</w:t>
+      </w:r>
+      <w:r>
+        <w:rPr>
+          <w:rFonts w:ascii="Courier New" w:hAnsi="Courier New" w:cs="Courier New"/>
+          <w:sz w:val="22"/>
+          <w:szCs w:val="22"/>
+          <w:lang w:val="en-US"/>
+        </w:rPr>
         <w:br/>
         <w:t xml:space="preserve">  "policy_path": "outputs/…/02_solve/policy.npz",</w:t>
+      </w:r>
+      <w:r>
+        <w:rPr>
+          <w:rFonts w:ascii="Courier New" w:hAnsi="Courier New" w:cs="Courier New"/>
+          <w:sz w:val="22"/>
+          <w:szCs w:val="22"/>
+          <w:lang w:val="en-US"/>
+        </w:rPr>
         <w:br/>
         <w:t xml:space="preserve">  "policy_npz_sha256": "f0f1e09c0b41cfc9…",</w:t>
+      </w:r>
+      <w:r>
+        <w:rPr>
+          <w:rFonts w:ascii="Courier New" w:hAnsi="Courier New" w:cs="Courier New"/>
+          <w:sz w:val="22"/>
+          <w:szCs w:val="22"/>
+          <w:lang w:val="en-US"/>
+        </w:rPr>
         <w:br/>
         <w:t xml:space="preserve">  "hydra_config": {"H_max": 6.0, "K_max": 8.0, "gamma_max": 8,</w:t>
+      </w:r>
+      <w:r>
+        <w:rPr>
+          <w:rFonts w:ascii="Courier New" w:hAnsi="Courier New" w:cs="Courier New"/>
+          <w:sz w:val="22"/>
+          <w:szCs w:val="22"/>
+          <w:lang w:val="en-US"/>
+        </w:rPr>
         <w:br/>
         <w:t xml:space="preserve">                    "N_H": 20, "N_K": 20, "lambda_discount": 0.99,</w:t>
+      </w:r>
+      <w:r>
+        <w:rPr>
+          <w:rFonts w:ascii="Courier New" w:hAnsi="Courier New" w:cs="Courier New"/>
+          <w:sz w:val="22"/>
+          <w:szCs w:val="22"/>
+          <w:lang w:val="en-US"/>
+        </w:rPr>
         <w:br/>
         <w:t xml:space="preserve">                    "kappa": 1.0, "alpha_smooth": 1.0, "nu_min": 5}</w:t>
+      </w:r>
+      <w:r>
+        <w:rPr>
+          <w:rFonts w:ascii="Courier New" w:hAnsi="Courier New" w:cs="Courier New"/>
+          <w:sz w:val="22"/>
+          <w:szCs w:val="22"/>
+          <w:lang w:val="en-US"/>
+        </w:rPr>
         <w:br/>
         <w:t>}</w:t>
       </w:r>

</xml_diff>